<commit_message>
2.3 gemaakt en toegevoegd
</commit_message>
<xml_diff>
--- a/Nathalie/S&C_Lesopdrachten_NK.docx
+++ b/Nathalie/S&C_Lesopdrachten_NK.docx
@@ -102,6 +102,7 @@
                                     <w:dataBinding w:prefixMappings="xmlns:ns0='http://purl.org/dc/elements/1.1/' xmlns:ns1='http://schemas.openxmlformats.org/package/2006/metadata/core-properties' " w:xpath="/ns1:coreProperties[1]/ns0:title[1]" w:storeItemID="{6C3C8BC8-F283-45AE-878A-BAB7291924A1}"/>
                                     <w:text/>
                                   </w:sdtPr>
+                                  <w:sdtEndPr/>
                                   <w:sdtContent>
                                     <w:r>
                                       <w:rPr>
@@ -166,6 +167,7 @@
                                   <w:dataBinding w:prefixMappings="xmlns:ns0='http://purl.org/dc/elements/1.1/' xmlns:ns1='http://schemas.openxmlformats.org/package/2006/metadata/core-properties' " w:xpath="/ns1:coreProperties[1]/ns0:subject[1]" w:storeItemID="{6C3C8BC8-F283-45AE-878A-BAB7291924A1}"/>
                                   <w:text/>
                                 </w:sdtPr>
+                                <w:sdtEndPr/>
                                 <w:sdtContent>
                                   <w:p>
                                     <w:pPr>
@@ -207,6 +209,7 @@
                                   <w:dataBinding w:prefixMappings="xmlns:ns0='http://purl.org/dc/elements/1.1/' xmlns:ns1='http://schemas.openxmlformats.org/package/2006/metadata/core-properties' " w:xpath="/ns1:coreProperties[1]/ns0:creator[1]" w:storeItemID="{6C3C8BC8-F283-45AE-878A-BAB7291924A1}"/>
                                   <w:text/>
                                 </w:sdtPr>
+                                <w:sdtEndPr/>
                                 <w:sdtContent>
                                   <w:p>
                                     <w:pPr>
@@ -531,6 +534,7 @@
                                     <w:calendar w:val="gregorian"/>
                                   </w:date>
                                 </w:sdtPr>
+                                <w:sdtEndPr/>
                                 <w:sdtContent>
                                   <w:p>
                                     <w:pPr>
@@ -3931,27 +3935,14 @@
       <w:r>
         <w:t xml:space="preserve"> </w:t>
       </w:r>
-      <w:r>
-        <w:fldChar w:fldCharType="begin"/>
-      </w:r>
-      <w:r>
-        <w:instrText xml:space="preserve"> SEQ Figuur \* ARABIC </w:instrText>
-      </w:r>
-      <w:r>
-        <w:fldChar w:fldCharType="separate"/>
-      </w:r>
-      <w:r>
-        <w:rPr>
-          <w:noProof/>
-        </w:rPr>
-        <w:t>3</w:t>
-      </w:r>
-      <w:r>
-        <w:rPr>
-          <w:noProof/>
-        </w:rPr>
-        <w:fldChar w:fldCharType="end"/>
-      </w:r>
+      <w:fldSimple w:instr=" SEQ Figuur \* ARABIC ">
+        <w:r>
+          <w:rPr>
+            <w:noProof/>
+          </w:rPr>
+          <w:t>1</w:t>
+        </w:r>
+      </w:fldSimple>
       <w:r>
         <w:t xml:space="preserve">: </w:t>
       </w:r>
@@ -4049,27 +4040,14 @@
       <w:r>
         <w:t xml:space="preserve"> </w:t>
       </w:r>
-      <w:r>
-        <w:fldChar w:fldCharType="begin"/>
-      </w:r>
-      <w:r>
-        <w:instrText xml:space="preserve"> SEQ Figuur \* ARABIC </w:instrText>
-      </w:r>
-      <w:r>
-        <w:fldChar w:fldCharType="separate"/>
-      </w:r>
-      <w:r>
-        <w:rPr>
-          <w:noProof/>
-        </w:rPr>
-        <w:t>4</w:t>
-      </w:r>
-      <w:r>
-        <w:rPr>
-          <w:noProof/>
-        </w:rPr>
-        <w:fldChar w:fldCharType="end"/>
-      </w:r>
+      <w:fldSimple w:instr=" SEQ Figuur \* ARABIC ">
+        <w:r>
+          <w:rPr>
+            <w:noProof/>
+          </w:rPr>
+          <w:t>2</w:t>
+        </w:r>
+      </w:fldSimple>
       <w:r>
         <w:t xml:space="preserve">: </w:t>
       </w:r>
@@ -4200,21 +4178,29 @@
         <w:pStyle w:val="Caption"/>
         <w:rPr>
           <w:color w:val="156082" w:themeColor="accent1"/>
-          <w:lang w:val="nl-NL"/>
+          <w:lang w:val="en-US"/>
         </w:rPr>
       </w:pPr>
-      <w:r>
-        <w:rPr>
-          <w:lang w:val="nl-NL"/>
-        </w:rPr>
-        <w:t xml:space="preserve">Figuur </w:t>
+      <w:proofErr w:type="spellStart"/>
+      <w:r>
+        <w:rPr>
+          <w:lang w:val="en-US"/>
+        </w:rPr>
+        <w:t>Figuur</w:t>
+      </w:r>
+      <w:proofErr w:type="spellEnd"/>
+      <w:r>
+        <w:rPr>
+          <w:lang w:val="en-US"/>
+        </w:rPr>
+        <w:t xml:space="preserve"> </w:t>
       </w:r>
       <w:r>
         <w:fldChar w:fldCharType="begin"/>
       </w:r>
       <w:r>
         <w:rPr>
-          <w:lang w:val="nl-NL"/>
+          <w:lang w:val="en-US"/>
         </w:rPr>
         <w:instrText xml:space="preserve"> SEQ Figuur \* ARABIC </w:instrText>
       </w:r>
@@ -4224,9 +4210,9 @@
       <w:r>
         <w:rPr>
           <w:noProof/>
-          <w:lang w:val="nl-NL"/>
-        </w:rPr>
-        <w:t>5</w:t>
+          <w:lang w:val="en-US"/>
+        </w:rPr>
+        <w:t>3</w:t>
       </w:r>
       <w:r>
         <w:rPr>
@@ -4236,9 +4222,23 @@
       </w:r>
       <w:r>
         <w:rPr>
-          <w:lang w:val="nl-NL"/>
-        </w:rPr>
-        <w:t>: Hacksplaining SQL Injection Completed</w:t>
+          <w:lang w:val="en-US"/>
+        </w:rPr>
+        <w:t xml:space="preserve">: </w:t>
+      </w:r>
+      <w:proofErr w:type="spellStart"/>
+      <w:r>
+        <w:rPr>
+          <w:lang w:val="en-US"/>
+        </w:rPr>
+        <w:t>Hacksplaining</w:t>
+      </w:r>
+      <w:proofErr w:type="spellEnd"/>
+      <w:r>
+        <w:rPr>
+          <w:lang w:val="en-US"/>
+        </w:rPr>
+        <w:t xml:space="preserve"> SQL Injection Completed</w:t>
       </w:r>
     </w:p>
     <w:p>
@@ -4315,27 +4315,14 @@
       <w:r>
         <w:t xml:space="preserve"> </w:t>
       </w:r>
-      <w:r>
-        <w:fldChar w:fldCharType="begin"/>
-      </w:r>
-      <w:r>
-        <w:instrText xml:space="preserve"> SEQ Figuur \* ARABIC </w:instrText>
-      </w:r>
-      <w:r>
-        <w:fldChar w:fldCharType="separate"/>
-      </w:r>
-      <w:r>
-        <w:rPr>
-          <w:noProof/>
-        </w:rPr>
-        <w:t>6</w:t>
-      </w:r>
-      <w:r>
-        <w:rPr>
-          <w:noProof/>
-        </w:rPr>
-        <w:fldChar w:fldCharType="end"/>
-      </w:r>
+      <w:fldSimple w:instr=" SEQ Figuur \* ARABIC ">
+        <w:r>
+          <w:rPr>
+            <w:noProof/>
+          </w:rPr>
+          <w:t>4</w:t>
+        </w:r>
+      </w:fldSimple>
       <w:r>
         <w:t xml:space="preserve">: </w:t>
       </w:r>
@@ -4441,27 +4428,14 @@
       <w:r>
         <w:t xml:space="preserve"> </w:t>
       </w:r>
-      <w:r>
-        <w:fldChar w:fldCharType="begin"/>
-      </w:r>
-      <w:r>
-        <w:instrText xml:space="preserve"> SEQ Figuur \* ARABIC </w:instrText>
-      </w:r>
-      <w:r>
-        <w:fldChar w:fldCharType="separate"/>
-      </w:r>
-      <w:r>
-        <w:rPr>
-          <w:noProof/>
-        </w:rPr>
-        <w:t>7</w:t>
-      </w:r>
-      <w:r>
-        <w:rPr>
-          <w:noProof/>
-        </w:rPr>
-        <w:fldChar w:fldCharType="end"/>
-      </w:r>
+      <w:fldSimple w:instr=" SEQ Figuur \* ARABIC ">
+        <w:r>
+          <w:rPr>
+            <w:noProof/>
+          </w:rPr>
+          <w:t>5</w:t>
+        </w:r>
+      </w:fldSimple>
       <w:r>
         <w:t xml:space="preserve">: </w:t>
       </w:r>
@@ -4550,27 +4524,14 @@
       <w:r>
         <w:t xml:space="preserve"> </w:t>
       </w:r>
-      <w:r>
-        <w:fldChar w:fldCharType="begin"/>
-      </w:r>
-      <w:r>
-        <w:instrText xml:space="preserve"> SEQ Figuur \* ARABIC </w:instrText>
-      </w:r>
-      <w:r>
-        <w:fldChar w:fldCharType="separate"/>
-      </w:r>
-      <w:r>
-        <w:rPr>
-          <w:noProof/>
-        </w:rPr>
-        <w:t>8</w:t>
-      </w:r>
-      <w:r>
-        <w:rPr>
-          <w:noProof/>
-        </w:rPr>
-        <w:fldChar w:fldCharType="end"/>
-      </w:r>
+      <w:fldSimple w:instr=" SEQ Figuur \* ARABIC ">
+        <w:r>
+          <w:rPr>
+            <w:noProof/>
+          </w:rPr>
+          <w:t>6</w:t>
+        </w:r>
+      </w:fldSimple>
       <w:r>
         <w:t xml:space="preserve">: </w:t>
       </w:r>
@@ -4797,7 +4758,7 @@
           <w:noProof/>
           <w:lang w:val="nl-NL"/>
         </w:rPr>
-        <w:t>9</w:t>
+        <w:t>7</w:t>
       </w:r>
       <w:r>
         <w:fldChar w:fldCharType="end"/>
@@ -4896,7 +4857,7 @@
           <w:noProof/>
           <w:lang w:val="nl-NL"/>
         </w:rPr>
-        <w:t>10</w:t>
+        <w:t>8</w:t>
       </w:r>
       <w:r>
         <w:fldChar w:fldCharType="end"/>
@@ -4911,13 +4872,22 @@
     <w:p>
       <w:pPr>
         <w:pStyle w:val="Heading2"/>
+        <w:rPr>
+          <w:lang w:val="nl-NL"/>
+        </w:rPr>
       </w:pPr>
       <w:bookmarkStart w:id="8" w:name="_Toc239866158"/>
       <w:r>
+        <w:rPr>
+          <w:lang w:val="nl-NL"/>
+        </w:rPr>
         <w:lastRenderedPageBreak/>
         <w:t xml:space="preserve">Opdracht 3: </w:t>
       </w:r>
       <w:r>
+        <w:rPr>
+          <w:lang w:val="nl-NL"/>
+        </w:rPr>
         <w:t>Suricata Log Analyse – Vergelijking Open vs Gesloten Segment</w:t>
       </w:r>
       <w:bookmarkEnd w:id="8"/>
@@ -7654,60 +7624,6 @@
           </w:p>
         </w:tc>
       </w:tr>
-      <w:tr>
-        <w:tc>
-          <w:tcPr>
-            <w:tcW w:w="0" w:type="auto"/>
-            <w:tcBorders>
-              <w:top w:val="outset" w:sz="6" w:space="0" w:color="auto"/>
-              <w:left w:val="outset" w:sz="6" w:space="0" w:color="auto"/>
-              <w:bottom w:val="outset" w:sz="6" w:space="0" w:color="auto"/>
-              <w:right w:val="outset" w:sz="6" w:space="0" w:color="auto"/>
-            </w:tcBorders>
-            <w:vAlign w:val="center"/>
-            <w:hideMark/>
-          </w:tcPr>
-          <w:p>
-            <w:pPr>
-              <w:rPr>
-                <w:color w:val="156082" w:themeColor="accent1"/>
-              </w:rPr>
-            </w:pPr>
-            <w:r>
-              <w:rPr>
-                <w:color w:val="156082" w:themeColor="accent1"/>
-              </w:rPr>
-              <w:t>60998</w:t>
-            </w:r>
-          </w:p>
-        </w:tc>
-        <w:tc>
-          <w:tcPr>
-            <w:tcW w:w="0" w:type="auto"/>
-            <w:tcBorders>
-              <w:top w:val="outset" w:sz="6" w:space="0" w:color="auto"/>
-              <w:left w:val="outset" w:sz="6" w:space="0" w:color="auto"/>
-              <w:bottom w:val="outset" w:sz="6" w:space="0" w:color="auto"/>
-              <w:right w:val="outset" w:sz="6" w:space="0" w:color="auto"/>
-            </w:tcBorders>
-            <w:vAlign w:val="center"/>
-            <w:hideMark/>
-          </w:tcPr>
-          <w:p>
-            <w:pPr>
-              <w:rPr>
-                <w:color w:val="156082" w:themeColor="accent1"/>
-              </w:rPr>
-            </w:pPr>
-            <w:r>
-              <w:rPr>
-                <w:color w:val="156082" w:themeColor="accent1"/>
-              </w:rPr>
-              <w:t>1</w:t>
-            </w:r>
-          </w:p>
-        </w:tc>
-      </w:tr>
     </w:tbl>
     <w:p>
       <w:pPr>
@@ -8412,24 +8328,14 @@
       <w:r>
         <w:t xml:space="preserve">Tabel </w:t>
       </w:r>
-      <w:r>
-        <w:fldChar w:fldCharType="begin"/>
-      </w:r>
-      <w:r>
-        <w:instrText xml:space="preserve"> SEQ Tabel \* ARABIC </w:instrText>
-      </w:r>
-      <w:r>
-        <w:fldChar w:fldCharType="separate"/>
-      </w:r>
-      <w:r>
-        <w:rPr>
-          <w:noProof/>
-        </w:rPr>
-        <w:t>1</w:t>
-      </w:r>
-      <w:r>
-        <w:fldChar w:fldCharType="end"/>
-      </w:r>
+      <w:fldSimple w:instr=" SEQ Tabel \* ARABIC ">
+        <w:r>
+          <w:rPr>
+            <w:noProof/>
+          </w:rPr>
+          <w:t>1</w:t>
+        </w:r>
+      </w:fldSimple>
       <w:r>
         <w:t xml:space="preserve">: Top 3 </w:t>
       </w:r>
@@ -11867,9 +11773,619 @@
           <w:color w:val="000000" w:themeColor="text1"/>
           <w:lang w:val="nl-NL"/>
         </w:rPr>
+      </w:pPr>
+      <w:r>
+        <w:rPr>
+          <w:color w:val="000000" w:themeColor="text1"/>
+          <w:lang w:val="nl-NL"/>
+        </w:rPr>
+        <w:t>Identity &amp; Access Management (IAM) zou ik ze</w:t>
+      </w:r>
+      <w:r>
+        <w:rPr>
+          <w:color w:val="000000" w:themeColor="text1"/>
+          <w:lang w:val="nl-NL"/>
+        </w:rPr>
+        <w:t xml:space="preserve">lf </w:t>
+      </w:r>
+      <w:r>
+        <w:rPr>
+          <w:color w:val="000000" w:themeColor="text1"/>
+          <w:lang w:val="nl-NL"/>
+        </w:rPr>
+        <w:t>niet uitbesteden</w:t>
+      </w:r>
+      <w:r>
+        <w:rPr>
+          <w:color w:val="000000" w:themeColor="text1"/>
+          <w:lang w:val="nl-NL"/>
+        </w:rPr>
+        <w:t xml:space="preserve">. Ik zou zelf willen bepalen wie toegang heeft tot welke systemen en gegevens. Een bedrijf weet zelf het beste </w:t>
+      </w:r>
+      <w:r>
+        <w:rPr>
+          <w:color w:val="000000" w:themeColor="text1"/>
+          <w:lang w:val="nl-NL"/>
+        </w:rPr>
+        <w:t xml:space="preserve">welke rechten medewerkers nodig hebben en wanneer deze moeten worden ingetrokken. </w:t>
+      </w:r>
+    </w:p>
+    <w:p>
+      <w:pPr>
+        <w:rPr>
+          <w:color w:val="000000" w:themeColor="text1"/>
+          <w:lang w:val="nl-NL"/>
+        </w:rPr>
+      </w:pPr>
+      <w:r>
+        <w:rPr>
+          <w:color w:val="000000" w:themeColor="text1"/>
+          <w:lang w:val="nl-NL"/>
+        </w:rPr>
+        <w:br w:type="page"/>
+      </w:r>
+    </w:p>
+    <w:p>
+      <w:pPr>
+        <w:pStyle w:val="Heading2"/>
+        <w:rPr>
+          <w:lang w:val="nl-NL"/>
+        </w:rPr>
+      </w:pPr>
+      <w:r>
+        <w:rPr>
+          <w:lang w:val="nl-NL"/>
+        </w:rPr>
+        <w:lastRenderedPageBreak/>
+        <w:t>Opdracht 3: Defense in Depth</w:t>
+      </w:r>
+    </w:p>
+    <w:p>
+      <w:pPr>
+        <w:pStyle w:val="Heading2"/>
+        <w:rPr>
+          <w:lang w:val="nl-NL"/>
+        </w:rPr>
+      </w:pPr>
+      <w:r>
+        <w:rPr>
+          <w:rStyle w:val="Heading3Char"/>
+          <w:lang w:val="nl-NL"/>
+        </w:rPr>
+        <w:t>Labscenario deel 1: Explore Azure Network Security Groups (NSGs)</w:t>
+      </w:r>
+      <w:r>
+        <w:rPr>
+          <w:lang w:val="nl-NL"/>
+        </w:rPr>
+        <w:t xml:space="preserve"> </w:t>
+      </w:r>
+    </w:p>
+    <w:p>
+      <w:pPr>
+        <w:rPr>
+          <w:color w:val="156082" w:themeColor="accent1"/>
+          <w:lang w:val="nl-NL"/>
+        </w:rPr>
+      </w:pPr>
+      <w:r>
+        <w:rPr>
+          <w:color w:val="156082" w:themeColor="accent1"/>
+          <w:lang w:val="nl-NL"/>
+        </w:rPr>
+        <w:t>In dit lab verken je de functie van Network Security Groups (NSG's) in Azure. Je doet dit door een network security group aan te maken en deze toe te wijzen aan de netwerkinterface van een Ubuntu virtual machine (VM). Deze Ubuntu VM dien je zelf te maken en je installeert Apache op deze server. Denk</w:t>
+      </w:r>
+      <w:r>
+        <w:rPr>
+          <w:color w:val="156082" w:themeColor="accent1"/>
+          <w:lang w:val="nl-NL"/>
+        </w:rPr>
+        <w:t xml:space="preserve"> a</w:t>
+      </w:r>
+      <w:r>
+        <w:rPr>
+          <w:color w:val="156082" w:themeColor="accent1"/>
+          <w:lang w:val="nl-NL"/>
+        </w:rPr>
+        <w:t xml:space="preserve">an de volgende onderdelen: </w:t>
+      </w:r>
+    </w:p>
+    <w:p>
+      <w:pPr>
+        <w:rPr>
+          <w:color w:val="156082" w:themeColor="accent1"/>
+          <w:lang w:val="nl-NL"/>
+        </w:rPr>
+      </w:pPr>
+      <w:r>
+        <w:rPr>
+          <w:color w:val="156082" w:themeColor="accent1"/>
+          <w:lang w:val="nl-NL"/>
+        </w:rPr>
+        <w:t xml:space="preserve">• Bekijk je de standaard inkomende en uitgaande regels </w:t>
+      </w:r>
+    </w:p>
+    <w:p>
+      <w:pPr>
+        <w:rPr>
+          <w:color w:val="156082" w:themeColor="accent1"/>
+          <w:lang w:val="nl-NL"/>
+        </w:rPr>
+      </w:pPr>
+      <w:r>
+        <w:rPr>
+          <w:color w:val="156082" w:themeColor="accent1"/>
+          <w:lang w:val="nl-NL"/>
+        </w:rPr>
+        <w:t xml:space="preserve">• Maak je nieuwe regels </w:t>
+      </w:r>
+    </w:p>
+    <w:p>
+      <w:pPr>
+        <w:rPr>
+          <w:color w:val="156082" w:themeColor="accent1"/>
+          <w:lang w:val="nl-NL"/>
+        </w:rPr>
+      </w:pPr>
+      <w:r>
+        <w:rPr>
+          <w:color w:val="156082" w:themeColor="accent1"/>
+          <w:lang w:val="nl-NL"/>
+        </w:rPr>
+        <w:t xml:space="preserve">• Test je deze regels actief </w:t>
+      </w:r>
+    </w:p>
+    <w:p>
+      <w:pPr>
+        <w:rPr>
+          <w:color w:val="156082" w:themeColor="accent1"/>
+          <w:lang w:val="nl-NL"/>
+        </w:rPr>
+      </w:pPr>
+      <w:r>
+        <w:rPr>
+          <w:color w:val="156082" w:themeColor="accent1"/>
+          <w:lang w:val="nl-NL"/>
+        </w:rPr>
+        <w:t xml:space="preserve">• Zorg dat je met een wachtwoord en gebruikersnaam op de Ubuntu server kan komen via Putty of een andere SSH tool </w:t>
+      </w:r>
+    </w:p>
+    <w:p>
+      <w:pPr>
+        <w:rPr>
+          <w:color w:val="156082" w:themeColor="accent1"/>
+          <w:lang w:val="nl-NL"/>
+        </w:rPr>
+      </w:pPr>
+      <w:r>
+        <w:rPr>
+          <w:color w:val="156082" w:themeColor="accent1"/>
+          <w:lang w:val="nl-NL"/>
+        </w:rPr>
+        <w:t xml:space="preserve">• Zorg je dat je de standard website van Apache ziet </w:t>
+      </w:r>
+    </w:p>
+    <w:p>
+      <w:pPr>
+        <w:rPr>
+          <w:color w:val="156082" w:themeColor="accent1"/>
+          <w:lang w:val="nl-NL"/>
+        </w:rPr>
+      </w:pPr>
+    </w:p>
+    <w:p>
+      <w:pPr>
+        <w:keepNext/>
+      </w:pPr>
+      <w:r>
+        <w:rPr>
+          <w:lang w:val="nl-NL"/>
+        </w:rPr>
+        <w:drawing>
+          <wp:inline distT="0" distB="0" distL="0" distR="0" wp14:anchorId="0B413310" wp14:editId="254D22F5">
+            <wp:extent cx="5731510" cy="3216910"/>
+            <wp:effectExtent l="0" t="0" r="2540" b="2540"/>
+            <wp:docPr id="1275234837" name="Picture 1"/>
+            <wp:cNvGraphicFramePr>
+              <a:graphicFrameLocks xmlns:a="http://schemas.openxmlformats.org/drawingml/2006/main" noChangeAspect="1"/>
+            </wp:cNvGraphicFramePr>
+            <a:graphic xmlns:a="http://schemas.openxmlformats.org/drawingml/2006/main">
+              <a:graphicData uri="http://schemas.openxmlformats.org/drawingml/2006/picture">
+                <pic:pic xmlns:pic="http://schemas.openxmlformats.org/drawingml/2006/picture">
+                  <pic:nvPicPr>
+                    <pic:cNvPr id="1275234837" name=""/>
+                    <pic:cNvPicPr/>
+                  </pic:nvPicPr>
+                  <pic:blipFill>
+                    <a:blip r:embed="rId17"/>
+                    <a:stretch>
+                      <a:fillRect/>
+                    </a:stretch>
+                  </pic:blipFill>
+                  <pic:spPr>
+                    <a:xfrm>
+                      <a:off x="0" y="0"/>
+                      <a:ext cx="5731510" cy="3216910"/>
+                    </a:xfrm>
+                    <a:prstGeom prst="rect">
+                      <a:avLst/>
+                    </a:prstGeom>
+                  </pic:spPr>
+                </pic:pic>
+              </a:graphicData>
+            </a:graphic>
+          </wp:inline>
+        </w:drawing>
+      </w:r>
+    </w:p>
+    <w:p>
+      <w:pPr>
+        <w:pStyle w:val="Caption"/>
+        <w:rPr>
+          <w:lang w:val="nl-NL"/>
+        </w:rPr>
+      </w:pPr>
+      <w:r>
+        <w:rPr>
+          <w:lang w:val="nl-NL"/>
+        </w:rPr>
+        <w:t xml:space="preserve">Figuur </w:t>
+      </w:r>
+      <w:r>
+        <w:fldChar w:fldCharType="begin"/>
+      </w:r>
+      <w:r>
+        <w:rPr>
+          <w:lang w:val="nl-NL"/>
+        </w:rPr>
+        <w:instrText xml:space="preserve"> SEQ Figuur \* ARABIC </w:instrText>
+      </w:r>
+      <w:r>
+        <w:fldChar w:fldCharType="separate"/>
+      </w:r>
+      <w:r>
+        <w:rPr>
+          <w:noProof/>
+          <w:lang w:val="nl-NL"/>
+        </w:rPr>
+        <w:t>9</w:t>
+      </w:r>
+      <w:r>
+        <w:fldChar w:fldCharType="end"/>
+      </w:r>
+      <w:r>
+        <w:rPr>
+          <w:lang w:val="nl-NL"/>
+        </w:rPr>
+        <w:t>: Deel 1 compleet bewijs</w:t>
+      </w:r>
+    </w:p>
+    <w:p>
+      <w:pPr>
+        <w:rPr>
+          <w:lang w:val="nl-NL"/>
+        </w:rPr>
+      </w:pPr>
+    </w:p>
+    <w:p>
+      <w:pPr>
+        <w:rPr>
+          <w:lang w:val="nl-NL"/>
+        </w:rPr>
+      </w:pPr>
+    </w:p>
+    <w:p>
+      <w:pPr>
+        <w:rPr>
+          <w:lang w:val="nl-NL"/>
+        </w:rPr>
+      </w:pPr>
+    </w:p>
+    <w:p>
+      <w:pPr>
+        <w:rPr>
+          <w:lang w:val="nl-NL"/>
+        </w:rPr>
+      </w:pPr>
+    </w:p>
+    <w:p>
+      <w:pPr>
+        <w:rPr>
+          <w:color w:val="000000" w:themeColor="text1"/>
+          <w:lang w:val="nl-NL"/>
+        </w:rPr>
+      </w:pPr>
+    </w:p>
+    <w:p>
+      <w:pPr>
+        <w:rPr>
+          <w:color w:val="000000" w:themeColor="text1"/>
+          <w:lang w:val="nl-NL"/>
+        </w:rPr>
+      </w:pPr>
+    </w:p>
+    <w:p>
+      <w:pPr>
+        <w:pStyle w:val="Heading3"/>
+        <w:rPr>
+          <w:lang w:val="nl-NL"/>
+        </w:rPr>
+      </w:pPr>
+      <w:r>
+        <w:rPr>
+          <w:lang w:val="nl-NL"/>
+        </w:rPr>
+        <w:t xml:space="preserve">Labscenario deel 2: Passwordless Connection </w:t>
+      </w:r>
+    </w:p>
+    <w:p>
+      <w:pPr>
+        <w:rPr>
+          <w:color w:val="156082" w:themeColor="accent1"/>
+          <w:lang w:val="nl-NL"/>
+        </w:rPr>
+      </w:pPr>
+      <w:r>
+        <w:rPr>
+          <w:color w:val="156082" w:themeColor="accent1"/>
+          <w:lang w:val="nl-NL"/>
+        </w:rPr>
+        <w:t>Secure verbinding opzetten dmv putty ZONDER gebruik te maken van wachtwoord en gebruikersnaam, maar middels een public/private key!</w:t>
+      </w:r>
+    </w:p>
+    <w:p>
+      <w:pPr>
+        <w:rPr>
+          <w:color w:val="156082" w:themeColor="accent1"/>
+          <w:lang w:val="nl-NL"/>
+        </w:rPr>
+      </w:pPr>
+    </w:p>
+    <w:p>
+      <w:pPr>
+        <w:keepNext/>
+      </w:pPr>
+      <w:r>
+        <w:rPr>
+          <w:color w:val="156082" w:themeColor="accent1"/>
+          <w:lang w:val="nl-NL"/>
+        </w:rPr>
+        <w:drawing>
+          <wp:inline distT="0" distB="0" distL="0" distR="0" wp14:anchorId="09AB4935" wp14:editId="48BEF8AD">
+            <wp:extent cx="5731510" cy="899795"/>
+            <wp:effectExtent l="0" t="0" r="2540" b="0"/>
+            <wp:docPr id="1597800288" name="Picture 1"/>
+            <wp:cNvGraphicFramePr>
+              <a:graphicFrameLocks xmlns:a="http://schemas.openxmlformats.org/drawingml/2006/main" noChangeAspect="1"/>
+            </wp:cNvGraphicFramePr>
+            <a:graphic xmlns:a="http://schemas.openxmlformats.org/drawingml/2006/main">
+              <a:graphicData uri="http://schemas.openxmlformats.org/drawingml/2006/picture">
+                <pic:pic xmlns:pic="http://schemas.openxmlformats.org/drawingml/2006/picture">
+                  <pic:nvPicPr>
+                    <pic:cNvPr id="1597800288" name=""/>
+                    <pic:cNvPicPr/>
+                  </pic:nvPicPr>
+                  <pic:blipFill>
+                    <a:blip r:embed="rId18"/>
+                    <a:stretch>
+                      <a:fillRect/>
+                    </a:stretch>
+                  </pic:blipFill>
+                  <pic:spPr>
+                    <a:xfrm>
+                      <a:off x="0" y="0"/>
+                      <a:ext cx="5731510" cy="899795"/>
+                    </a:xfrm>
+                    <a:prstGeom prst="rect">
+                      <a:avLst/>
+                    </a:prstGeom>
+                  </pic:spPr>
+                </pic:pic>
+              </a:graphicData>
+            </a:graphic>
+          </wp:inline>
+        </w:drawing>
+      </w:r>
+    </w:p>
+    <w:p>
+      <w:pPr>
+        <w:pStyle w:val="Caption"/>
+        <w:rPr>
+          <w:lang w:val="nl-NL"/>
+        </w:rPr>
+      </w:pPr>
+      <w:r>
+        <w:rPr>
+          <w:lang w:val="nl-NL"/>
+        </w:rPr>
+        <w:t xml:space="preserve">Figuur </w:t>
+      </w:r>
+      <w:r>
+        <w:fldChar w:fldCharType="begin"/>
+      </w:r>
+      <w:r>
+        <w:rPr>
+          <w:lang w:val="nl-NL"/>
+        </w:rPr>
+        <w:instrText xml:space="preserve"> SEQ Figuur \* ARABIC </w:instrText>
+      </w:r>
+      <w:r>
+        <w:fldChar w:fldCharType="separate"/>
+      </w:r>
+      <w:r>
+        <w:rPr>
+          <w:noProof/>
+          <w:lang w:val="nl-NL"/>
+        </w:rPr>
+        <w:t>10</w:t>
+      </w:r>
+      <w:r>
+        <w:fldChar w:fldCharType="end"/>
+      </w:r>
+      <w:r>
+        <w:rPr>
+          <w:lang w:val="nl-NL"/>
+        </w:rPr>
+        <w:t>: Inloggen met private key bewijs</w:t>
+      </w:r>
+    </w:p>
+    <w:p>
+      <w:pPr>
+        <w:rPr>
+          <w:lang w:val="nl-NL"/>
+        </w:rPr>
+      </w:pPr>
+    </w:p>
+    <w:p>
+      <w:pPr>
+        <w:pStyle w:val="Heading3"/>
+        <w:rPr>
+          <w:lang w:val="nl-NL"/>
+        </w:rPr>
+      </w:pPr>
+      <w:r>
+        <w:rPr>
+          <w:lang w:val="nl-NL"/>
+        </w:rPr>
+        <w:t>Labscenario deel 3: More</w:t>
+      </w:r>
+      <w:r>
+        <w:rPr>
+          <w:lang w:val="nl-NL"/>
+        </w:rPr>
+        <w:t>?</w:t>
+      </w:r>
+    </w:p>
+    <w:p>
+      <w:pPr>
+        <w:rPr>
+          <w:color w:val="156082" w:themeColor="accent1"/>
+          <w:lang w:val="nl-NL"/>
+        </w:rPr>
+      </w:pPr>
+      <w:r>
+        <w:rPr>
+          <w:color w:val="156082" w:themeColor="accent1"/>
+          <w:lang w:val="nl-NL"/>
+        </w:rPr>
+        <w:t>Je hebt nu gebruik gemaakt van 2 lagen van beveiliging. Kijk zelf of je ervoor kunt zorgen hoe je meer lagen van beveiliging zou kunnen toepassen voor deze Webserver en past dit eventueel toe.</w:t>
+      </w:r>
+    </w:p>
+    <w:p>
+      <w:pPr>
+        <w:rPr>
+          <w:lang w:val="nl-NL"/>
+        </w:rPr>
+      </w:pPr>
+      <w:r>
+        <w:rPr>
+          <w:lang w:val="nl-NL"/>
+        </w:rPr>
+        <w:t xml:space="preserve">Het toevoegen van een UFW zorgt voor een extra beveiligingslaag. Het inkomende en uitgaande verkeer wordt nu ook nog eens door de Ubuntu server gecheckt. </w:t>
+      </w:r>
+    </w:p>
+    <w:p>
+      <w:pPr>
+        <w:keepNext/>
+      </w:pPr>
+      <w:r>
+        <w:rPr>
+          <w:color w:val="156082" w:themeColor="accent1"/>
+          <w:lang w:val="nl-NL"/>
+        </w:rPr>
+        <w:drawing>
+          <wp:inline distT="0" distB="0" distL="0" distR="0" wp14:anchorId="63FF27D7" wp14:editId="4021BB8B">
+            <wp:extent cx="5731510" cy="3566795"/>
+            <wp:effectExtent l="0" t="0" r="2540" b="0"/>
+            <wp:docPr id="1498034186" name="Picture 1"/>
+            <wp:cNvGraphicFramePr>
+              <a:graphicFrameLocks xmlns:a="http://schemas.openxmlformats.org/drawingml/2006/main" noChangeAspect="1"/>
+            </wp:cNvGraphicFramePr>
+            <a:graphic xmlns:a="http://schemas.openxmlformats.org/drawingml/2006/main">
+              <a:graphicData uri="http://schemas.openxmlformats.org/drawingml/2006/picture">
+                <pic:pic xmlns:pic="http://schemas.openxmlformats.org/drawingml/2006/picture">
+                  <pic:nvPicPr>
+                    <pic:cNvPr id="1498034186" name=""/>
+                    <pic:cNvPicPr/>
+                  </pic:nvPicPr>
+                  <pic:blipFill>
+                    <a:blip r:embed="rId19"/>
+                    <a:stretch>
+                      <a:fillRect/>
+                    </a:stretch>
+                  </pic:blipFill>
+                  <pic:spPr>
+                    <a:xfrm>
+                      <a:off x="0" y="0"/>
+                      <a:ext cx="5731510" cy="3566795"/>
+                    </a:xfrm>
+                    <a:prstGeom prst="rect">
+                      <a:avLst/>
+                    </a:prstGeom>
+                  </pic:spPr>
+                </pic:pic>
+              </a:graphicData>
+            </a:graphic>
+          </wp:inline>
+        </w:drawing>
+      </w:r>
+    </w:p>
+    <w:p>
+      <w:pPr>
+        <w:pStyle w:val="Caption"/>
+      </w:pPr>
+      <w:proofErr w:type="spellStart"/>
+      <w:r>
+        <w:t>Figuur</w:t>
+      </w:r>
+      <w:proofErr w:type="spellEnd"/>
+      <w:r>
+        <w:t xml:space="preserve"> </w:t>
+      </w:r>
+      <w:fldSimple w:instr=" SEQ Figuur \* ARABIC ">
+        <w:r>
+          <w:rPr>
+            <w:noProof/>
+          </w:rPr>
+          <w:t>11</w:t>
+        </w:r>
+      </w:fldSimple>
+      <w:r>
+        <w:t xml:space="preserve">: Uncomplicated Firewall </w:t>
+      </w:r>
+      <w:proofErr w:type="spellStart"/>
+      <w:r>
+        <w:t>toegevoegd</w:t>
+      </w:r>
+      <w:proofErr w:type="spellEnd"/>
+    </w:p>
+    <w:p>
+      <w:pPr>
+        <w:rPr>
+          <w:i/>
+          <w:iCs/>
+          <w:color w:val="0E2841" w:themeColor="text2"/>
+          <w:sz w:val="18"/>
+          <w:szCs w:val="18"/>
+        </w:rPr>
+      </w:pPr>
+      <w:r>
+        <w:br w:type="page"/>
+      </w:r>
+    </w:p>
+    <w:p>
+      <w:pPr>
+        <w:rPr>
+          <w:i/>
+          <w:iCs/>
+          <w:color w:val="156082" w:themeColor="accent1"/>
+          <w:sz w:val="18"/>
+          <w:szCs w:val="18"/>
+          <w:lang w:val="nl-NL"/>
+        </w:rPr>
         <w:sectPr>
-          <w:footerReference w:type="default" r:id="rId17"/>
-          <w:footerReference w:type="first" r:id="rId18"/>
+          <w:footerReference w:type="default" r:id="rId20"/>
+          <w:footerReference w:type="first" r:id="rId21"/>
           <w:pgSz w:w="11906" w:h="16838"/>
           <w:pgMar w:top="1440" w:right="1440" w:bottom="1440" w:left="1440" w:header="708" w:footer="708" w:gutter="0"/>
           <w:pgNumType w:start="1"/>
@@ -11877,41 +12393,6 @@
           <w:docGrid w:linePitch="360"/>
         </w:sectPr>
       </w:pPr>
-      <w:r>
-        <w:rPr>
-          <w:color w:val="000000" w:themeColor="text1"/>
-          <w:lang w:val="nl-NL"/>
-        </w:rPr>
-        <w:t>Identity &amp; Access Management (IAM) zou ik ze</w:t>
-      </w:r>
-      <w:r>
-        <w:rPr>
-          <w:color w:val="000000" w:themeColor="text1"/>
-          <w:lang w:val="nl-NL"/>
-        </w:rPr>
-        <w:t xml:space="preserve">lf </w:t>
-      </w:r>
-      <w:r>
-        <w:rPr>
-          <w:color w:val="000000" w:themeColor="text1"/>
-          <w:lang w:val="nl-NL"/>
-        </w:rPr>
-        <w:t>niet uitbesteden</w:t>
-      </w:r>
-      <w:r>
-        <w:rPr>
-          <w:color w:val="000000" w:themeColor="text1"/>
-          <w:lang w:val="nl-NL"/>
-        </w:rPr>
-        <w:t xml:space="preserve">. Ik zou zelf willen bepalen wie toegang heeft tot welke systemen en gegevens. Een bedrijf weet zelf het beste </w:t>
-      </w:r>
-      <w:r>
-        <w:rPr>
-          <w:color w:val="000000" w:themeColor="text1"/>
-          <w:lang w:val="nl-NL"/>
-        </w:rPr>
-        <w:t xml:space="preserve">welke rechten medewerkers nodig hebben en wanneer deze moeten worden ingetrokken. </w:t>
-      </w:r>
     </w:p>
     <w:p>
       <w:pPr>
@@ -32437,43 +32918,7 @@
           <w:lang w:val="nl-NL"/>
         </w:rPr>
         <w:lastRenderedPageBreak/>
-        <w:t xml:space="preserve">Bijlage </w:t>
-      </w:r>
-      <w:r>
-        <w:rPr>
-          <w:lang w:val="nl-NL"/>
-        </w:rPr>
-        <w:t>2</w:t>
-      </w:r>
-      <w:r>
-        <w:rPr>
-          <w:lang w:val="nl-NL"/>
-        </w:rPr>
-        <w:t>: Suricata Logs VM</w:t>
-      </w:r>
-      <w:r>
-        <w:rPr>
-          <w:lang w:val="nl-NL"/>
-        </w:rPr>
-        <w:t>2</w:t>
-      </w:r>
-      <w:r>
-        <w:rPr>
-          <w:lang w:val="nl-NL"/>
-        </w:rPr>
-        <w:t xml:space="preserve"> (</w:t>
-      </w:r>
-      <w:r>
-        <w:rPr>
-          <w:lang w:val="nl-NL"/>
-        </w:rPr>
-        <w:t>gesloten</w:t>
-      </w:r>
-      <w:r>
-        <w:rPr>
-          <w:lang w:val="nl-NL"/>
-        </w:rPr>
-        <w:t xml:space="preserve"> segment)</w:t>
+        <w:t>Bijlage 2: Suricata Logs VM2 (gesloten segment)</w:t>
       </w:r>
       <w:bookmarkEnd w:id="20"/>
     </w:p>

</xml_diff>

<commit_message>
2.4 gemaakt en toegevoegd
</commit_message>
<xml_diff>
--- a/Nathalie/S&C_Lesopdrachten_NK.docx
+++ b/Nathalie/S&C_Lesopdrachten_NK.docx
@@ -696,7 +696,7 @@
           <w:r>
             <w:fldChar w:fldCharType="separate"/>
           </w:r>
-          <w:hyperlink w:anchor="_Toc239866150" w:history="1">
+          <w:hyperlink w:anchor="_Toc239939470" w:history="1">
             <w:r>
               <w:rPr>
                 <w:rStyle w:val="Hyperlink"/>
@@ -724,7 +724,7 @@
                 <w:noProof/>
                 <w:webHidden/>
               </w:rPr>
-              <w:instrText xml:space="preserve"> PAGEREF _Toc239866150 \h </w:instrText>
+              <w:instrText xml:space="preserve"> PAGEREF _Toc239939470 \h </w:instrText>
             </w:r>
             <w:r>
               <w:rPr>
@@ -767,7 +767,7 @@
               <w:lang w:eastAsia="en-NL"/>
             </w:rPr>
           </w:pPr>
-          <w:hyperlink w:anchor="_Toc239866151" w:history="1">
+          <w:hyperlink w:anchor="_Toc239939471" w:history="1">
             <w:r>
               <w:rPr>
                 <w:rStyle w:val="Hyperlink"/>
@@ -795,7 +795,7 @@
                 <w:noProof/>
                 <w:webHidden/>
               </w:rPr>
-              <w:instrText xml:space="preserve"> PAGEREF _Toc239866151 \h </w:instrText>
+              <w:instrText xml:space="preserve"> PAGEREF _Toc239939471 \h </w:instrText>
             </w:r>
             <w:r>
               <w:rPr>
@@ -838,7 +838,7 @@
               <w:lang w:eastAsia="en-NL"/>
             </w:rPr>
           </w:pPr>
-          <w:hyperlink w:anchor="_Toc239866152" w:history="1">
+          <w:hyperlink w:anchor="_Toc239939472" w:history="1">
             <w:r>
               <w:rPr>
                 <w:rStyle w:val="Hyperlink"/>
@@ -866,7 +866,7 @@
                 <w:noProof/>
                 <w:webHidden/>
               </w:rPr>
-              <w:instrText xml:space="preserve"> PAGEREF _Toc239866152 \h </w:instrText>
+              <w:instrText xml:space="preserve"> PAGEREF _Toc239939472 \h </w:instrText>
             </w:r>
             <w:r>
               <w:rPr>
@@ -909,7 +909,7 @@
               <w:lang w:eastAsia="en-NL"/>
             </w:rPr>
           </w:pPr>
-          <w:hyperlink w:anchor="_Toc239866153" w:history="1">
+          <w:hyperlink w:anchor="_Toc239939473" w:history="1">
             <w:r>
               <w:rPr>
                 <w:rStyle w:val="Hyperlink"/>
@@ -937,7 +937,7 @@
                 <w:noProof/>
                 <w:webHidden/>
               </w:rPr>
-              <w:instrText xml:space="preserve"> PAGEREF _Toc239866153 \h </w:instrText>
+              <w:instrText xml:space="preserve"> PAGEREF _Toc239939473 \h </w:instrText>
             </w:r>
             <w:r>
               <w:rPr>
@@ -980,7 +980,7 @@
               <w:lang w:eastAsia="en-NL"/>
             </w:rPr>
           </w:pPr>
-          <w:hyperlink w:anchor="_Toc239866154" w:history="1">
+          <w:hyperlink w:anchor="_Toc239939474" w:history="1">
             <w:r>
               <w:rPr>
                 <w:rStyle w:val="Hyperlink"/>
@@ -1008,7 +1008,7 @@
                 <w:noProof/>
                 <w:webHidden/>
               </w:rPr>
-              <w:instrText xml:space="preserve"> PAGEREF _Toc239866154 \h </w:instrText>
+              <w:instrText xml:space="preserve"> PAGEREF _Toc239939474 \h </w:instrText>
             </w:r>
             <w:r>
               <w:rPr>
@@ -1051,7 +1051,7 @@
               <w:lang w:eastAsia="en-NL"/>
             </w:rPr>
           </w:pPr>
-          <w:hyperlink w:anchor="_Toc239866155" w:history="1">
+          <w:hyperlink w:anchor="_Toc239939475" w:history="1">
             <w:r>
               <w:rPr>
                 <w:rStyle w:val="Hyperlink"/>
@@ -1079,7 +1079,7 @@
                 <w:noProof/>
                 <w:webHidden/>
               </w:rPr>
-              <w:instrText xml:space="preserve"> PAGEREF _Toc239866155 \h </w:instrText>
+              <w:instrText xml:space="preserve"> PAGEREF _Toc239939475 \h </w:instrText>
             </w:r>
             <w:r>
               <w:rPr>
@@ -1122,7 +1122,7 @@
               <w:lang w:eastAsia="en-NL"/>
             </w:rPr>
           </w:pPr>
-          <w:hyperlink w:anchor="_Toc239866156" w:history="1">
+          <w:hyperlink w:anchor="_Toc239939476" w:history="1">
             <w:r>
               <w:rPr>
                 <w:rStyle w:val="Hyperlink"/>
@@ -1150,7 +1150,7 @@
                 <w:noProof/>
                 <w:webHidden/>
               </w:rPr>
-              <w:instrText xml:space="preserve"> PAGEREF _Toc239866156 \h </w:instrText>
+              <w:instrText xml:space="preserve"> PAGEREF _Toc239939476 \h </w:instrText>
             </w:r>
             <w:r>
               <w:rPr>
@@ -1193,7 +1193,7 @@
               <w:lang w:eastAsia="en-NL"/>
             </w:rPr>
           </w:pPr>
-          <w:hyperlink w:anchor="_Toc239866157" w:history="1">
+          <w:hyperlink w:anchor="_Toc239939477" w:history="1">
             <w:r>
               <w:rPr>
                 <w:rStyle w:val="Hyperlink"/>
@@ -1221,7 +1221,7 @@
                 <w:noProof/>
                 <w:webHidden/>
               </w:rPr>
-              <w:instrText xml:space="preserve"> PAGEREF _Toc239866157 \h </w:instrText>
+              <w:instrText xml:space="preserve"> PAGEREF _Toc239939477 \h </w:instrText>
             </w:r>
             <w:r>
               <w:rPr>
@@ -1264,11 +1264,12 @@
               <w:lang w:eastAsia="en-NL"/>
             </w:rPr>
           </w:pPr>
-          <w:hyperlink w:anchor="_Toc239866158" w:history="1">
+          <w:hyperlink w:anchor="_Toc239939478" w:history="1">
             <w:r>
               <w:rPr>
                 <w:rStyle w:val="Hyperlink"/>
                 <w:noProof/>
+                <w:lang w:val="nl-NL"/>
               </w:rPr>
               <w:t>Opdracht 3: Suricata Log Analyse – Vergelijking Open vs Gesloten Segment</w:t>
             </w:r>
@@ -1291,7 +1292,7 @@
                 <w:noProof/>
                 <w:webHidden/>
               </w:rPr>
-              <w:instrText xml:space="preserve"> PAGEREF _Toc239866158 \h </w:instrText>
+              <w:instrText xml:space="preserve"> PAGEREF _Toc239939478 \h </w:instrText>
             </w:r>
             <w:r>
               <w:rPr>
@@ -1334,7 +1335,7 @@
               <w:lang w:eastAsia="en-NL"/>
             </w:rPr>
           </w:pPr>
-          <w:hyperlink w:anchor="_Toc239866159" w:history="1">
+          <w:hyperlink w:anchor="_Toc239939479" w:history="1">
             <w:r>
               <w:rPr>
                 <w:rStyle w:val="Hyperlink"/>
@@ -1362,7 +1363,7 @@
                 <w:noProof/>
                 <w:webHidden/>
               </w:rPr>
-              <w:instrText xml:space="preserve"> PAGEREF _Toc239866159 \h </w:instrText>
+              <w:instrText xml:space="preserve"> PAGEREF _Toc239939479 \h </w:instrText>
             </w:r>
             <w:r>
               <w:rPr>
@@ -1405,7 +1406,7 @@
               <w:lang w:eastAsia="en-NL"/>
             </w:rPr>
           </w:pPr>
-          <w:hyperlink w:anchor="_Toc239866160" w:history="1">
+          <w:hyperlink w:anchor="_Toc239939480" w:history="1">
             <w:r>
               <w:rPr>
                 <w:rStyle w:val="Hyperlink"/>
@@ -1433,7 +1434,7 @@
                 <w:noProof/>
                 <w:webHidden/>
               </w:rPr>
-              <w:instrText xml:space="preserve"> PAGEREF _Toc239866160 \h </w:instrText>
+              <w:instrText xml:space="preserve"> PAGEREF _Toc239939480 \h </w:instrText>
             </w:r>
             <w:r>
               <w:rPr>
@@ -1476,7 +1477,7 @@
               <w:lang w:eastAsia="en-NL"/>
             </w:rPr>
           </w:pPr>
-          <w:hyperlink w:anchor="_Toc239866161" w:history="1">
+          <w:hyperlink w:anchor="_Toc239939481" w:history="1">
             <w:r>
               <w:rPr>
                 <w:rStyle w:val="Hyperlink"/>
@@ -1504,7 +1505,7 @@
                 <w:noProof/>
                 <w:webHidden/>
               </w:rPr>
-              <w:instrText xml:space="preserve"> PAGEREF _Toc239866161 \h </w:instrText>
+              <w:instrText xml:space="preserve"> PAGEREF _Toc239939481 \h </w:instrText>
             </w:r>
             <w:r>
               <w:rPr>
@@ -1547,7 +1548,7 @@
               <w:lang w:eastAsia="en-NL"/>
             </w:rPr>
           </w:pPr>
-          <w:hyperlink w:anchor="_Toc239866162" w:history="1">
+          <w:hyperlink w:anchor="_Toc239939482" w:history="1">
             <w:r>
               <w:rPr>
                 <w:rStyle w:val="Hyperlink"/>
@@ -1575,7 +1576,7 @@
                 <w:noProof/>
                 <w:webHidden/>
               </w:rPr>
-              <w:instrText xml:space="preserve"> PAGEREF _Toc239866162 \h </w:instrText>
+              <w:instrText xml:space="preserve"> PAGEREF _Toc239939482 \h </w:instrText>
             </w:r>
             <w:r>
               <w:rPr>
@@ -1618,7 +1619,7 @@
               <w:lang w:eastAsia="en-NL"/>
             </w:rPr>
           </w:pPr>
-          <w:hyperlink w:anchor="_Toc239866163" w:history="1">
+          <w:hyperlink w:anchor="_Toc239939483" w:history="1">
             <w:r>
               <w:rPr>
                 <w:rStyle w:val="Hyperlink"/>
@@ -1646,7 +1647,7 @@
                 <w:noProof/>
                 <w:webHidden/>
               </w:rPr>
-              <w:instrText xml:space="preserve"> PAGEREF _Toc239866163 \h </w:instrText>
+              <w:instrText xml:space="preserve"> PAGEREF _Toc239939483 \h </w:instrText>
             </w:r>
             <w:r>
               <w:rPr>
@@ -1689,7 +1690,7 @@
               <w:lang w:eastAsia="en-NL"/>
             </w:rPr>
           </w:pPr>
-          <w:hyperlink w:anchor="_Toc239866164" w:history="1">
+          <w:hyperlink w:anchor="_Toc239939484" w:history="1">
             <w:r>
               <w:rPr>
                 <w:rStyle w:val="Hyperlink"/>
@@ -1717,7 +1718,7 @@
                 <w:noProof/>
                 <w:webHidden/>
               </w:rPr>
-              <w:instrText xml:space="preserve"> PAGEREF _Toc239866164 \h </w:instrText>
+              <w:instrText xml:space="preserve"> PAGEREF _Toc239939484 \h </w:instrText>
             </w:r>
             <w:r>
               <w:rPr>
@@ -1760,7 +1761,7 @@
               <w:lang w:eastAsia="en-NL"/>
             </w:rPr>
           </w:pPr>
-          <w:hyperlink w:anchor="_Toc239866165" w:history="1">
+          <w:hyperlink w:anchor="_Toc239939485" w:history="1">
             <w:r>
               <w:rPr>
                 <w:rStyle w:val="Hyperlink"/>
@@ -1788,7 +1789,7 @@
                 <w:noProof/>
                 <w:webHidden/>
               </w:rPr>
-              <w:instrText xml:space="preserve"> PAGEREF _Toc239866165 \h </w:instrText>
+              <w:instrText xml:space="preserve"> PAGEREF _Toc239939485 \h </w:instrText>
             </w:r>
             <w:r>
               <w:rPr>
@@ -1831,7 +1832,7 @@
               <w:lang w:eastAsia="en-NL"/>
             </w:rPr>
           </w:pPr>
-          <w:hyperlink w:anchor="_Toc239866166" w:history="1">
+          <w:hyperlink w:anchor="_Toc239939486" w:history="1">
             <w:r>
               <w:rPr>
                 <w:rStyle w:val="Hyperlink"/>
@@ -1859,7 +1860,7 @@
                 <w:noProof/>
                 <w:webHidden/>
               </w:rPr>
-              <w:instrText xml:space="preserve"> PAGEREF _Toc239866166 \h </w:instrText>
+              <w:instrText xml:space="preserve"> PAGEREF _Toc239939486 \h </w:instrText>
             </w:r>
             <w:r>
               <w:rPr>
@@ -1902,7 +1903,7 @@
               <w:lang w:eastAsia="en-NL"/>
             </w:rPr>
           </w:pPr>
-          <w:hyperlink w:anchor="_Toc239866167" w:history="1">
+          <w:hyperlink w:anchor="_Toc239939487" w:history="1">
             <w:r>
               <w:rPr>
                 <w:rStyle w:val="Hyperlink"/>
@@ -1930,7 +1931,7 @@
                 <w:noProof/>
                 <w:webHidden/>
               </w:rPr>
-              <w:instrText xml:space="preserve"> PAGEREF _Toc239866167 \h </w:instrText>
+              <w:instrText xml:space="preserve"> PAGEREF _Toc239939487 \h </w:instrText>
             </w:r>
             <w:r>
               <w:rPr>
@@ -1951,6 +1952,360 @@
                 <w:webHidden/>
               </w:rPr>
               <w:t>19</w:t>
+            </w:r>
+            <w:r>
+              <w:rPr>
+                <w:noProof/>
+                <w:webHidden/>
+              </w:rPr>
+              <w:fldChar w:fldCharType="end"/>
+            </w:r>
+          </w:hyperlink>
+        </w:p>
+        <w:p>
+          <w:pPr>
+            <w:pStyle w:val="TOC2"/>
+            <w:tabs>
+              <w:tab w:val="right" w:leader="dot" w:pos="9016"/>
+            </w:tabs>
+            <w:rPr>
+              <w:rFonts w:eastAsiaTheme="minorEastAsia"/>
+              <w:noProof/>
+              <w:lang w:eastAsia="en-NL"/>
+            </w:rPr>
+          </w:pPr>
+          <w:hyperlink w:anchor="_Toc239939488" w:history="1">
+            <w:r>
+              <w:rPr>
+                <w:rStyle w:val="Hyperlink"/>
+                <w:noProof/>
+              </w:rPr>
+              <w:t>Opdracht 3: Defense in Depth</w:t>
+            </w:r>
+            <w:r>
+              <w:rPr>
+                <w:noProof/>
+                <w:webHidden/>
+              </w:rPr>
+              <w:tab/>
+            </w:r>
+            <w:r>
+              <w:rPr>
+                <w:noProof/>
+                <w:webHidden/>
+              </w:rPr>
+              <w:fldChar w:fldCharType="begin"/>
+            </w:r>
+            <w:r>
+              <w:rPr>
+                <w:noProof/>
+                <w:webHidden/>
+              </w:rPr>
+              <w:instrText xml:space="preserve"> PAGEREF _Toc239939488 \h </w:instrText>
+            </w:r>
+            <w:r>
+              <w:rPr>
+                <w:noProof/>
+                <w:webHidden/>
+              </w:rPr>
+            </w:r>
+            <w:r>
+              <w:rPr>
+                <w:noProof/>
+                <w:webHidden/>
+              </w:rPr>
+              <w:fldChar w:fldCharType="separate"/>
+            </w:r>
+            <w:r>
+              <w:rPr>
+                <w:noProof/>
+                <w:webHidden/>
+              </w:rPr>
+              <w:t>21</w:t>
+            </w:r>
+            <w:r>
+              <w:rPr>
+                <w:noProof/>
+                <w:webHidden/>
+              </w:rPr>
+              <w:fldChar w:fldCharType="end"/>
+            </w:r>
+          </w:hyperlink>
+        </w:p>
+        <w:p>
+          <w:pPr>
+            <w:pStyle w:val="TOC3"/>
+            <w:tabs>
+              <w:tab w:val="right" w:leader="dot" w:pos="9016"/>
+            </w:tabs>
+            <w:rPr>
+              <w:rFonts w:eastAsiaTheme="minorEastAsia"/>
+              <w:noProof/>
+              <w:lang w:eastAsia="en-NL"/>
+            </w:rPr>
+          </w:pPr>
+          <w:hyperlink w:anchor="_Toc239939489" w:history="1">
+            <w:r>
+              <w:rPr>
+                <w:rStyle w:val="Hyperlink"/>
+                <w:noProof/>
+                <w:lang w:val="en-US"/>
+              </w:rPr>
+              <w:t>Labscenario deel 1: Explore Azure Network Security Groups (NSGs)</w:t>
+            </w:r>
+            <w:r>
+              <w:rPr>
+                <w:noProof/>
+                <w:webHidden/>
+              </w:rPr>
+              <w:tab/>
+            </w:r>
+            <w:r>
+              <w:rPr>
+                <w:noProof/>
+                <w:webHidden/>
+              </w:rPr>
+              <w:fldChar w:fldCharType="begin"/>
+            </w:r>
+            <w:r>
+              <w:rPr>
+                <w:noProof/>
+                <w:webHidden/>
+              </w:rPr>
+              <w:instrText xml:space="preserve"> PAGEREF _Toc239939489 \h </w:instrText>
+            </w:r>
+            <w:r>
+              <w:rPr>
+                <w:noProof/>
+                <w:webHidden/>
+              </w:rPr>
+            </w:r>
+            <w:r>
+              <w:rPr>
+                <w:noProof/>
+                <w:webHidden/>
+              </w:rPr>
+              <w:fldChar w:fldCharType="separate"/>
+            </w:r>
+            <w:r>
+              <w:rPr>
+                <w:noProof/>
+                <w:webHidden/>
+              </w:rPr>
+              <w:t>21</w:t>
+            </w:r>
+            <w:r>
+              <w:rPr>
+                <w:noProof/>
+                <w:webHidden/>
+              </w:rPr>
+              <w:fldChar w:fldCharType="end"/>
+            </w:r>
+          </w:hyperlink>
+        </w:p>
+        <w:p>
+          <w:pPr>
+            <w:pStyle w:val="TOC3"/>
+            <w:tabs>
+              <w:tab w:val="right" w:leader="dot" w:pos="9016"/>
+            </w:tabs>
+            <w:rPr>
+              <w:rFonts w:eastAsiaTheme="minorEastAsia"/>
+              <w:noProof/>
+              <w:lang w:eastAsia="en-NL"/>
+            </w:rPr>
+          </w:pPr>
+          <w:hyperlink w:anchor="_Toc239939490" w:history="1">
+            <w:r>
+              <w:rPr>
+                <w:rStyle w:val="Hyperlink"/>
+                <w:noProof/>
+                <w:lang w:val="nl-NL"/>
+              </w:rPr>
+              <w:t>Labscenario deel 2: Passwordless Connection</w:t>
+            </w:r>
+            <w:r>
+              <w:rPr>
+                <w:noProof/>
+                <w:webHidden/>
+              </w:rPr>
+              <w:tab/>
+            </w:r>
+            <w:r>
+              <w:rPr>
+                <w:noProof/>
+                <w:webHidden/>
+              </w:rPr>
+              <w:fldChar w:fldCharType="begin"/>
+            </w:r>
+            <w:r>
+              <w:rPr>
+                <w:noProof/>
+                <w:webHidden/>
+              </w:rPr>
+              <w:instrText xml:space="preserve"> PAGEREF _Toc239939490 \h </w:instrText>
+            </w:r>
+            <w:r>
+              <w:rPr>
+                <w:noProof/>
+                <w:webHidden/>
+              </w:rPr>
+            </w:r>
+            <w:r>
+              <w:rPr>
+                <w:noProof/>
+                <w:webHidden/>
+              </w:rPr>
+              <w:fldChar w:fldCharType="separate"/>
+            </w:r>
+            <w:r>
+              <w:rPr>
+                <w:noProof/>
+                <w:webHidden/>
+              </w:rPr>
+              <w:t>22</w:t>
+            </w:r>
+            <w:r>
+              <w:rPr>
+                <w:noProof/>
+                <w:webHidden/>
+              </w:rPr>
+              <w:fldChar w:fldCharType="end"/>
+            </w:r>
+          </w:hyperlink>
+        </w:p>
+        <w:p>
+          <w:pPr>
+            <w:pStyle w:val="TOC3"/>
+            <w:tabs>
+              <w:tab w:val="right" w:leader="dot" w:pos="9016"/>
+            </w:tabs>
+            <w:rPr>
+              <w:rFonts w:eastAsiaTheme="minorEastAsia"/>
+              <w:noProof/>
+              <w:lang w:eastAsia="en-NL"/>
+            </w:rPr>
+          </w:pPr>
+          <w:hyperlink w:anchor="_Toc239939491" w:history="1">
+            <w:r>
+              <w:rPr>
+                <w:rStyle w:val="Hyperlink"/>
+                <w:noProof/>
+                <w:lang w:val="nl-NL"/>
+              </w:rPr>
+              <w:t>Labscenario deel 3: More?</w:t>
+            </w:r>
+            <w:r>
+              <w:rPr>
+                <w:noProof/>
+                <w:webHidden/>
+              </w:rPr>
+              <w:tab/>
+            </w:r>
+            <w:r>
+              <w:rPr>
+                <w:noProof/>
+                <w:webHidden/>
+              </w:rPr>
+              <w:fldChar w:fldCharType="begin"/>
+            </w:r>
+            <w:r>
+              <w:rPr>
+                <w:noProof/>
+                <w:webHidden/>
+              </w:rPr>
+              <w:instrText xml:space="preserve"> PAGEREF _Toc239939491 \h </w:instrText>
+            </w:r>
+            <w:r>
+              <w:rPr>
+                <w:noProof/>
+                <w:webHidden/>
+              </w:rPr>
+            </w:r>
+            <w:r>
+              <w:rPr>
+                <w:noProof/>
+                <w:webHidden/>
+              </w:rPr>
+              <w:fldChar w:fldCharType="separate"/>
+            </w:r>
+            <w:r>
+              <w:rPr>
+                <w:noProof/>
+                <w:webHidden/>
+              </w:rPr>
+              <w:t>22</w:t>
+            </w:r>
+            <w:r>
+              <w:rPr>
+                <w:noProof/>
+                <w:webHidden/>
+              </w:rPr>
+              <w:fldChar w:fldCharType="end"/>
+            </w:r>
+          </w:hyperlink>
+        </w:p>
+        <w:p>
+          <w:pPr>
+            <w:pStyle w:val="TOC2"/>
+            <w:tabs>
+              <w:tab w:val="right" w:leader="dot" w:pos="9016"/>
+            </w:tabs>
+            <w:rPr>
+              <w:rFonts w:eastAsiaTheme="minorEastAsia"/>
+              <w:noProof/>
+              <w:lang w:eastAsia="en-NL"/>
+            </w:rPr>
+          </w:pPr>
+          <w:hyperlink w:anchor="_Toc239939492" w:history="1">
+            <w:r>
+              <w:rPr>
+                <w:rStyle w:val="Hyperlink"/>
+                <w:noProof/>
+                <w:lang w:val="nl-NL"/>
+              </w:rPr>
+              <w:t>Opdracht 4  – Azure IAM &amp; SAS-token: Public vs Private Access</w:t>
+            </w:r>
+            <w:r>
+              <w:rPr>
+                <w:noProof/>
+                <w:webHidden/>
+              </w:rPr>
+              <w:tab/>
+            </w:r>
+            <w:r>
+              <w:rPr>
+                <w:noProof/>
+                <w:webHidden/>
+              </w:rPr>
+              <w:fldChar w:fldCharType="begin"/>
+            </w:r>
+            <w:r>
+              <w:rPr>
+                <w:noProof/>
+                <w:webHidden/>
+              </w:rPr>
+              <w:instrText xml:space="preserve"> PAGEREF _Toc239939492 \h </w:instrText>
+            </w:r>
+            <w:r>
+              <w:rPr>
+                <w:noProof/>
+                <w:webHidden/>
+              </w:rPr>
+            </w:r>
+            <w:r>
+              <w:rPr>
+                <w:noProof/>
+                <w:webHidden/>
+              </w:rPr>
+              <w:fldChar w:fldCharType="separate"/>
+            </w:r>
+            <w:r>
+              <w:rPr>
+                <w:noProof/>
+                <w:webHidden/>
+              </w:rPr>
+              <w:t>23</w:t>
             </w:r>
             <w:r>
               <w:rPr>
@@ -1973,7 +2328,7 @@
               <w:lang w:eastAsia="en-NL"/>
             </w:rPr>
           </w:pPr>
-          <w:hyperlink w:anchor="_Toc239866168" w:history="1">
+          <w:hyperlink w:anchor="_Toc239939493" w:history="1">
             <w:r>
               <w:rPr>
                 <w:rStyle w:val="Hyperlink"/>
@@ -2001,7 +2356,7 @@
                 <w:noProof/>
                 <w:webHidden/>
               </w:rPr>
-              <w:instrText xml:space="preserve"> PAGEREF _Toc239866168 \h </w:instrText>
+              <w:instrText xml:space="preserve"> PAGEREF _Toc239939493 \h </w:instrText>
             </w:r>
             <w:r>
               <w:rPr>
@@ -2021,7 +2376,7 @@
                 <w:noProof/>
                 <w:webHidden/>
               </w:rPr>
-              <w:t>21</w:t>
+              <w:t>29</w:t>
             </w:r>
             <w:r>
               <w:rPr>
@@ -2044,7 +2399,7 @@
               <w:lang w:eastAsia="en-NL"/>
             </w:rPr>
           </w:pPr>
-          <w:hyperlink w:anchor="_Toc239866169" w:history="1">
+          <w:hyperlink w:anchor="_Toc239939494" w:history="1">
             <w:r>
               <w:rPr>
                 <w:rStyle w:val="Hyperlink"/>
@@ -2072,7 +2427,7 @@
                 <w:noProof/>
                 <w:webHidden/>
               </w:rPr>
-              <w:instrText xml:space="preserve"> PAGEREF _Toc239866169 \h </w:instrText>
+              <w:instrText xml:space="preserve"> PAGEREF _Toc239939494 \h </w:instrText>
             </w:r>
             <w:r>
               <w:rPr>
@@ -2092,7 +2447,7 @@
                 <w:noProof/>
                 <w:webHidden/>
               </w:rPr>
-              <w:t>21</w:t>
+              <w:t>29</w:t>
             </w:r>
             <w:r>
               <w:rPr>
@@ -2115,7 +2470,7 @@
               <w:lang w:eastAsia="en-NL"/>
             </w:rPr>
           </w:pPr>
-          <w:hyperlink w:anchor="_Toc239866170" w:history="1">
+          <w:hyperlink w:anchor="_Toc239939495" w:history="1">
             <w:r>
               <w:rPr>
                 <w:rStyle w:val="Hyperlink"/>
@@ -2143,7 +2498,7 @@
                 <w:noProof/>
                 <w:webHidden/>
               </w:rPr>
-              <w:instrText xml:space="preserve"> PAGEREF _Toc239866170 \h </w:instrText>
+              <w:instrText xml:space="preserve"> PAGEREF _Toc239939495 \h </w:instrText>
             </w:r>
             <w:r>
               <w:rPr>
@@ -2163,7 +2518,7 @@
                 <w:noProof/>
                 <w:webHidden/>
               </w:rPr>
-              <w:t>41</w:t>
+              <w:t>49</w:t>
             </w:r>
             <w:r>
               <w:rPr>
@@ -2207,7 +2562,7 @@
           <w:lang w:val="nl-NL"/>
         </w:rPr>
       </w:pPr>
-      <w:bookmarkStart w:id="0" w:name="_Toc239866150"/>
+      <w:bookmarkStart w:id="0" w:name="_Toc239939470"/>
       <w:r>
         <w:rPr>
           <w:lang w:val="nl-NL"/>
@@ -2224,7 +2579,7 @@
           <w:lang w:val="nl-NL"/>
         </w:rPr>
       </w:pPr>
-      <w:bookmarkStart w:id="1" w:name="_Toc239866151"/>
+      <w:bookmarkStart w:id="1" w:name="_Toc239939471"/>
       <w:r>
         <w:rPr>
           <w:lang w:val="nl-NL"/>
@@ -2712,7 +3067,7 @@
           <w:lang w:val="nl-NL"/>
         </w:rPr>
       </w:pPr>
-      <w:bookmarkStart w:id="2" w:name="_Toc239866152"/>
+      <w:bookmarkStart w:id="2" w:name="_Toc239939472"/>
       <w:r>
         <w:rPr>
           <w:lang w:val="nl-NL"/>
@@ -3078,7 +3433,7 @@
           <w:lang w:val="nl-NL"/>
         </w:rPr>
       </w:pPr>
-      <w:bookmarkStart w:id="3" w:name="_Toc239866153"/>
+      <w:bookmarkStart w:id="3" w:name="_Toc239939473"/>
       <w:r>
         <w:rPr>
           <w:lang w:val="nl-NL"/>
@@ -3861,7 +4216,7 @@
           <w:lang w:val="nl-NL"/>
         </w:rPr>
       </w:pPr>
-      <w:bookmarkStart w:id="4" w:name="_Toc239866154"/>
+      <w:bookmarkStart w:id="4" w:name="_Toc239939474"/>
       <w:r>
         <w:rPr>
           <w:lang w:val="nl-NL"/>
@@ -3962,7 +4317,7 @@
           <w:lang w:val="en-US"/>
         </w:rPr>
       </w:pPr>
-      <w:bookmarkStart w:id="5" w:name="_Toc239866155"/>
+      <w:bookmarkStart w:id="5" w:name="_Toc239939475"/>
       <w:proofErr w:type="spellStart"/>
       <w:r>
         <w:rPr>
@@ -4081,7 +4436,7 @@
           <w:lang w:val="en-US"/>
         </w:rPr>
       </w:pPr>
-      <w:bookmarkStart w:id="6" w:name="_Toc239866156"/>
+      <w:bookmarkStart w:id="6" w:name="_Toc239939476"/>
       <w:proofErr w:type="spellStart"/>
       <w:r>
         <w:rPr>
@@ -4558,7 +4913,7 @@
           <w:lang w:val="en-US"/>
         </w:rPr>
       </w:pPr>
-      <w:bookmarkStart w:id="7" w:name="_Toc239866157"/>
+      <w:bookmarkStart w:id="7" w:name="_Toc239939477"/>
       <w:proofErr w:type="spellStart"/>
       <w:r>
         <w:rPr>
@@ -4876,7 +5231,7 @@
           <w:lang w:val="nl-NL"/>
         </w:rPr>
       </w:pPr>
-      <w:bookmarkStart w:id="8" w:name="_Toc239866158"/>
+      <w:bookmarkStart w:id="8" w:name="_Toc239939478"/>
       <w:r>
         <w:rPr>
           <w:lang w:val="nl-NL"/>
@@ -4899,7 +5254,7 @@
           <w:lang w:val="nl-NL"/>
         </w:rPr>
       </w:pPr>
-      <w:bookmarkStart w:id="9" w:name="_Toc239866159"/>
+      <w:bookmarkStart w:id="9" w:name="_Toc239939479"/>
       <w:r>
         <w:rPr>
           <w:lang w:val="nl-NL"/>
@@ -5654,7 +6009,7 @@
           <w:lang w:val="nl-NL"/>
         </w:rPr>
       </w:pPr>
-      <w:bookmarkStart w:id="10" w:name="_Toc239866160"/>
+      <w:bookmarkStart w:id="10" w:name="_Toc239939480"/>
       <w:r>
         <w:rPr>
           <w:lang w:val="nl-NL"/>
@@ -6031,7 +6386,7 @@
           <w:lang w:val="nl-NL"/>
         </w:rPr>
       </w:pPr>
-      <w:bookmarkStart w:id="11" w:name="_Toc239866161"/>
+      <w:bookmarkStart w:id="11" w:name="_Toc239939481"/>
       <w:r>
         <w:rPr>
           <w:lang w:val="nl-NL"/>
@@ -7662,7 +8017,7 @@
           <w:lang w:val="nl-NL"/>
         </w:rPr>
       </w:pPr>
-      <w:bookmarkStart w:id="12" w:name="_Toc239866162"/>
+      <w:bookmarkStart w:id="12" w:name="_Toc239939482"/>
       <w:r>
         <w:rPr>
           <w:lang w:val="nl-NL"/>
@@ -8443,7 +8798,7 @@
           <w:lang w:val="nl-NL"/>
         </w:rPr>
       </w:pPr>
-      <w:bookmarkStart w:id="13" w:name="_Toc239866163"/>
+      <w:bookmarkStart w:id="13" w:name="_Toc239939483"/>
       <w:r>
         <w:rPr>
           <w:lang w:val="nl-NL"/>
@@ -8603,7 +8958,7 @@
           <w:lang w:val="nl-NL"/>
         </w:rPr>
       </w:pPr>
-      <w:bookmarkStart w:id="14" w:name="_Toc239866164"/>
+      <w:bookmarkStart w:id="14" w:name="_Toc239939484"/>
       <w:r>
         <w:rPr>
           <w:lang w:val="nl-NL"/>
@@ -8876,7 +9231,7 @@
           <w:lang w:val="nl-NL"/>
         </w:rPr>
       </w:pPr>
-      <w:bookmarkStart w:id="15" w:name="_Toc239866165"/>
+      <w:bookmarkStart w:id="15" w:name="_Toc239939485"/>
       <w:r>
         <w:rPr>
           <w:lang w:val="nl-NL"/>
@@ -8899,7 +9254,7 @@
           <w:lang w:val="nl-NL"/>
         </w:rPr>
       </w:pPr>
-      <w:bookmarkStart w:id="16" w:name="_Toc239866166"/>
+      <w:bookmarkStart w:id="16" w:name="_Toc239939486"/>
       <w:r>
         <w:rPr>
           <w:lang w:val="nl-NL"/>
@@ -9220,7 +9575,7 @@
           <w:lang w:val="nl-NL"/>
         </w:rPr>
       </w:pPr>
-      <w:bookmarkStart w:id="17" w:name="_Toc239866167"/>
+      <w:bookmarkStart w:id="17" w:name="_Toc239939487"/>
       <w:r>
         <w:rPr>
           <w:lang w:val="nl-NL"/>
@@ -11828,35 +12183,71 @@
     <w:p>
       <w:pPr>
         <w:pStyle w:val="Heading2"/>
-        <w:rPr>
-          <w:lang w:val="nl-NL"/>
-        </w:rPr>
       </w:pPr>
-      <w:r>
-        <w:rPr>
-          <w:lang w:val="nl-NL"/>
-        </w:rPr>
+      <w:bookmarkStart w:id="18" w:name="_Toc239939488"/>
+      <w:proofErr w:type="spellStart"/>
+      <w:r>
         <w:lastRenderedPageBreak/>
-        <w:t>Opdracht 3: Defense in Depth</w:t>
-      </w:r>
+        <w:t>Opdracht</w:t>
+      </w:r>
+      <w:proofErr w:type="spellEnd"/>
+      <w:r>
+        <w:t xml:space="preserve"> 3: </w:t>
+      </w:r>
+      <w:proofErr w:type="spellStart"/>
+      <w:r>
+        <w:t>Defense</w:t>
+      </w:r>
+      <w:proofErr w:type="spellEnd"/>
+      <w:r>
+        <w:t xml:space="preserve"> in Depth</w:t>
+      </w:r>
+      <w:bookmarkEnd w:id="18"/>
     </w:p>
     <w:p>
       <w:pPr>
-        <w:pStyle w:val="Heading2"/>
-        <w:rPr>
-          <w:lang w:val="nl-NL"/>
+        <w:pStyle w:val="Heading3"/>
+        <w:rPr>
+          <w:lang w:val="en-US"/>
         </w:rPr>
       </w:pPr>
+      <w:bookmarkStart w:id="19" w:name="_Toc239939489"/>
+      <w:proofErr w:type="spellStart"/>
       <w:r>
         <w:rPr>
           <w:rStyle w:val="Heading3Char"/>
-          <w:lang w:val="nl-NL"/>
-        </w:rPr>
-        <w:t>Labscenario deel 1: Explore Azure Network Security Groups (NSGs)</w:t>
-      </w:r>
-      <w:r>
-        <w:rPr>
-          <w:lang w:val="nl-NL"/>
+          <w:lang w:val="en-US"/>
+        </w:rPr>
+        <w:t>Labscenario</w:t>
+      </w:r>
+      <w:proofErr w:type="spellEnd"/>
+      <w:r>
+        <w:rPr>
+          <w:rStyle w:val="Heading3Char"/>
+          <w:lang w:val="en-US"/>
+        </w:rPr>
+        <w:t xml:space="preserve"> </w:t>
+      </w:r>
+      <w:proofErr w:type="spellStart"/>
+      <w:r>
+        <w:rPr>
+          <w:rStyle w:val="Heading3Char"/>
+          <w:lang w:val="en-US"/>
+        </w:rPr>
+        <w:t>deel</w:t>
+      </w:r>
+      <w:proofErr w:type="spellEnd"/>
+      <w:r>
+        <w:rPr>
+          <w:rStyle w:val="Heading3Char"/>
+          <w:lang w:val="en-US"/>
+        </w:rPr>
+        <w:t xml:space="preserve"> 1: Explore Azure Network Security Groups (NSGs)</w:t>
+      </w:r>
+      <w:bookmarkEnd w:id="19"/>
+      <w:r>
+        <w:rPr>
+          <w:lang w:val="en-US"/>
         </w:rPr>
         <w:t xml:space="preserve"> </w:t>
       </w:r>
@@ -11979,6 +12370,7 @@
       </w:pPr>
       <w:r>
         <w:rPr>
+          <w:noProof/>
           <w:lang w:val="nl-NL"/>
         </w:rPr>
         <w:drawing>
@@ -12111,11 +12503,19 @@
           <w:lang w:val="nl-NL"/>
         </w:rPr>
       </w:pPr>
-      <w:r>
-        <w:rPr>
-          <w:lang w:val="nl-NL"/>
-        </w:rPr>
-        <w:t xml:space="preserve">Labscenario deel 2: Passwordless Connection </w:t>
+      <w:bookmarkStart w:id="20" w:name="_Toc239939490"/>
+      <w:r>
+        <w:rPr>
+          <w:lang w:val="nl-NL"/>
+        </w:rPr>
+        <w:t>Labscenario deel 2: Passwordless Connection</w:t>
+      </w:r>
+      <w:bookmarkEnd w:id="20"/>
+      <w:r>
+        <w:rPr>
+          <w:lang w:val="nl-NL"/>
+        </w:rPr>
+        <w:t xml:space="preserve"> </w:t>
       </w:r>
     </w:p>
     <w:p>
@@ -12147,6 +12547,7 @@
       </w:pPr>
       <w:r>
         <w:rPr>
+          <w:noProof/>
           <w:color w:val="156082" w:themeColor="accent1"/>
           <w:lang w:val="nl-NL"/>
         </w:rPr>
@@ -12243,6 +12644,7 @@
           <w:lang w:val="nl-NL"/>
         </w:rPr>
       </w:pPr>
+      <w:bookmarkStart w:id="21" w:name="_Toc239939491"/>
       <w:r>
         <w:rPr>
           <w:lang w:val="nl-NL"/>
@@ -12255,6 +12657,7 @@
         </w:rPr>
         <w:t>?</w:t>
       </w:r>
+      <w:bookmarkEnd w:id="21"/>
     </w:p>
     <w:p>
       <w:pPr>
@@ -12290,6 +12693,7 @@
       </w:pPr>
       <w:r>
         <w:rPr>
+          <w:noProof/>
           <w:color w:val="156082" w:themeColor="accent1"/>
           <w:lang w:val="nl-NL"/>
         </w:rPr>
@@ -12333,6 +12737,435 @@
     <w:p>
       <w:pPr>
         <w:pStyle w:val="Caption"/>
+        <w:rPr>
+          <w:lang w:val="nl-NL"/>
+        </w:rPr>
+      </w:pPr>
+      <w:r>
+        <w:rPr>
+          <w:lang w:val="nl-NL"/>
+        </w:rPr>
+        <w:t xml:space="preserve">Figuur </w:t>
+      </w:r>
+      <w:r>
+        <w:fldChar w:fldCharType="begin"/>
+      </w:r>
+      <w:r>
+        <w:rPr>
+          <w:lang w:val="nl-NL"/>
+        </w:rPr>
+        <w:instrText xml:space="preserve"> SEQ Figuur \* ARABIC </w:instrText>
+      </w:r>
+      <w:r>
+        <w:fldChar w:fldCharType="separate"/>
+      </w:r>
+      <w:r>
+        <w:rPr>
+          <w:noProof/>
+          <w:lang w:val="nl-NL"/>
+        </w:rPr>
+        <w:t>11</w:t>
+      </w:r>
+      <w:r>
+        <w:rPr>
+          <w:noProof/>
+        </w:rPr>
+        <w:fldChar w:fldCharType="end"/>
+      </w:r>
+      <w:r>
+        <w:rPr>
+          <w:lang w:val="nl-NL"/>
+        </w:rPr>
+        <w:t>: Uncomplicated Firewall toegevoegd</w:t>
+      </w:r>
+    </w:p>
+    <w:p>
+      <w:pPr>
+        <w:pStyle w:val="Heading2"/>
+        <w:rPr>
+          <w:lang w:val="nl-NL"/>
+        </w:rPr>
+      </w:pPr>
+      <w:r>
+        <w:rPr>
+          <w:lang w:val="nl-NL"/>
+        </w:rPr>
+        <w:br w:type="page"/>
+      </w:r>
+      <w:bookmarkStart w:id="22" w:name="_Toc239939492"/>
+      <w:r>
+        <w:rPr>
+          <w:lang w:val="nl-NL"/>
+        </w:rPr>
+        <w:lastRenderedPageBreak/>
+        <w:t xml:space="preserve">Opdracht 4 </w:t>
+      </w:r>
+      <w:r>
+        <w:rPr>
+          <w:lang w:val="nl-NL"/>
+        </w:rPr>
+        <w:t xml:space="preserve"> – Azure IAM &amp; SAS-token: Public vs Private Access</w:t>
+      </w:r>
+      <w:bookmarkEnd w:id="22"/>
+      <w:r>
+        <w:rPr>
+          <w:lang w:val="nl-NL"/>
+        </w:rPr>
+        <w:t xml:space="preserve"> </w:t>
+      </w:r>
+    </w:p>
+    <w:p>
+      <w:pPr>
+        <w:rPr>
+          <w:color w:val="156082" w:themeColor="accent1"/>
+          <w:lang w:val="nl-NL"/>
+        </w:rPr>
+      </w:pPr>
+      <w:r>
+        <w:rPr>
+          <w:color w:val="156082" w:themeColor="accent1"/>
+          <w:lang w:val="nl-NL"/>
+        </w:rPr>
+        <w:t xml:space="preserve">In deze opdracht onderzoek je toegangsbeheer binnen Azure Storage Accounts. Je leert het verschil tussen toegangscontrole via Identity and Access Management (IAM) en toegang via een SAS-token. Je gebruikt een eigen resource group waarin je de rol Contributor hebt en dus zelf resources kunt aanmaken. Doel van de opdracht Je ervaart het verschil tussen publieke toegang, toegang via SAS-tokens en toegang op basis van IAM-rechten. Ook test je hoe tijdelijk toegangsbeheer werkt met een vervaltijd. </w:t>
+      </w:r>
+    </w:p>
+    <w:p>
+      <w:pPr>
+        <w:rPr>
+          <w:color w:val="156082" w:themeColor="accent1"/>
+          <w:lang w:val="nl-NL"/>
+        </w:rPr>
+      </w:pPr>
+    </w:p>
+    <w:p>
+      <w:pPr>
+        <w:rPr>
+          <w:color w:val="156082" w:themeColor="accent1"/>
+          <w:lang w:val="nl-NL"/>
+        </w:rPr>
+      </w:pPr>
+      <w:r>
+        <w:rPr>
+          <w:color w:val="156082" w:themeColor="accent1"/>
+          <w:lang w:val="nl-NL"/>
+        </w:rPr>
+        <w:t xml:space="preserve">Opdrachtstappen </w:t>
+      </w:r>
+    </w:p>
+    <w:p>
+      <w:pPr>
+        <w:rPr>
+          <w:color w:val="156082" w:themeColor="accent1"/>
+          <w:lang w:val="nl-NL"/>
+        </w:rPr>
+      </w:pPr>
+      <w:r>
+        <w:rPr>
+          <w:color w:val="156082" w:themeColor="accent1"/>
+          <w:lang w:val="nl-NL"/>
+        </w:rPr>
+        <w:t xml:space="preserve">1. Maak in je eigen resource group een nieuwe Storage Account aan (standard v2, region: West Europe). </w:t>
+      </w:r>
+    </w:p>
+    <w:p>
+      <w:pPr>
+        <w:rPr>
+          <w:lang w:val="nl-NL"/>
+        </w:rPr>
+      </w:pPr>
+      <w:r>
+        <w:rPr>
+          <w:lang w:val="nl-NL"/>
+        </w:rPr>
+        <w:t xml:space="preserve">Binnen het abonnement van Data Protection heb ik geen bevoegdheid om een eigen resource groep aan te maken. Het nieuwe Storage Account staat daarom in de algemene testomgeving van Data Protection. </w:t>
+      </w:r>
+    </w:p>
+    <w:p>
+      <w:pPr>
+        <w:rPr>
+          <w:lang w:val="nl-NL"/>
+        </w:rPr>
+      </w:pPr>
+    </w:p>
+    <w:p>
+      <w:pPr>
+        <w:rPr>
+          <w:color w:val="156082" w:themeColor="accent1"/>
+          <w:lang w:val="nl-NL"/>
+        </w:rPr>
+      </w:pPr>
+      <w:r>
+        <w:rPr>
+          <w:color w:val="156082" w:themeColor="accent1"/>
+          <w:lang w:val="nl-NL"/>
+        </w:rPr>
+        <w:t xml:space="preserve">2. Maak twee containers aan: </w:t>
+      </w:r>
+    </w:p>
+    <w:p>
+      <w:pPr>
+        <w:rPr>
+          <w:color w:val="156082" w:themeColor="accent1"/>
+          <w:lang w:val="en-US"/>
+        </w:rPr>
+      </w:pPr>
+      <w:r>
+        <w:rPr>
+          <w:color w:val="156082" w:themeColor="accent1"/>
+          <w:lang w:val="en-US"/>
+        </w:rPr>
+        <w:t xml:space="preserve">• - `public-container`: </w:t>
+      </w:r>
+      <w:proofErr w:type="spellStart"/>
+      <w:r>
+        <w:rPr>
+          <w:color w:val="156082" w:themeColor="accent1"/>
+          <w:lang w:val="en-US"/>
+        </w:rPr>
+        <w:t>publieke</w:t>
+      </w:r>
+      <w:proofErr w:type="spellEnd"/>
+      <w:r>
+        <w:rPr>
+          <w:color w:val="156082" w:themeColor="accent1"/>
+          <w:lang w:val="en-US"/>
+        </w:rPr>
+        <w:t xml:space="preserve"> </w:t>
+      </w:r>
+      <w:proofErr w:type="spellStart"/>
+      <w:r>
+        <w:rPr>
+          <w:color w:val="156082" w:themeColor="accent1"/>
+          <w:lang w:val="en-US"/>
+        </w:rPr>
+        <w:t>toegang</w:t>
+      </w:r>
+      <w:proofErr w:type="spellEnd"/>
+      <w:r>
+        <w:rPr>
+          <w:color w:val="156082" w:themeColor="accent1"/>
+          <w:lang w:val="en-US"/>
+        </w:rPr>
+        <w:t xml:space="preserve"> </w:t>
+      </w:r>
+      <w:proofErr w:type="spellStart"/>
+      <w:r>
+        <w:rPr>
+          <w:color w:val="156082" w:themeColor="accent1"/>
+          <w:lang w:val="en-US"/>
+        </w:rPr>
+        <w:t>toegestaan</w:t>
+      </w:r>
+      <w:proofErr w:type="spellEnd"/>
+      <w:r>
+        <w:rPr>
+          <w:color w:val="156082" w:themeColor="accent1"/>
+          <w:lang w:val="en-US"/>
+        </w:rPr>
+        <w:t xml:space="preserve"> (anonymous read access for blobs only) </w:t>
+      </w:r>
+    </w:p>
+    <w:p>
+      <w:pPr>
+        <w:rPr>
+          <w:color w:val="156082" w:themeColor="accent1"/>
+          <w:lang w:val="nl-NL"/>
+        </w:rPr>
+      </w:pPr>
+      <w:r>
+        <w:rPr>
+          <w:color w:val="156082" w:themeColor="accent1"/>
+          <w:lang w:val="nl-NL"/>
+        </w:rPr>
+        <w:t xml:space="preserve">• - `private-container`: geen publieke toegang </w:t>
+      </w:r>
+    </w:p>
+    <w:p>
+      <w:pPr>
+        <w:keepNext/>
+      </w:pPr>
+      <w:r>
+        <w:rPr>
+          <w:color w:val="156082" w:themeColor="accent1"/>
+          <w:lang w:val="nl-NL"/>
+        </w:rPr>
+        <w:drawing>
+          <wp:inline distT="0" distB="0" distL="0" distR="0" wp14:anchorId="703414A6" wp14:editId="33E410AA">
+            <wp:extent cx="5655733" cy="2023933"/>
+            <wp:effectExtent l="0" t="0" r="2540" b="0"/>
+            <wp:docPr id="94921566" name="Picture 1"/>
+            <wp:cNvGraphicFramePr>
+              <a:graphicFrameLocks xmlns:a="http://schemas.openxmlformats.org/drawingml/2006/main" noChangeAspect="1"/>
+            </wp:cNvGraphicFramePr>
+            <a:graphic xmlns:a="http://schemas.openxmlformats.org/drawingml/2006/main">
+              <a:graphicData uri="http://schemas.openxmlformats.org/drawingml/2006/picture">
+                <pic:pic xmlns:pic="http://schemas.openxmlformats.org/drawingml/2006/picture">
+                  <pic:nvPicPr>
+                    <pic:cNvPr id="94921566" name=""/>
+                    <pic:cNvPicPr/>
+                  </pic:nvPicPr>
+                  <pic:blipFill>
+                    <a:blip r:embed="rId20"/>
+                    <a:stretch>
+                      <a:fillRect/>
+                    </a:stretch>
+                  </pic:blipFill>
+                  <pic:spPr>
+                    <a:xfrm>
+                      <a:off x="0" y="0"/>
+                      <a:ext cx="5669502" cy="2028860"/>
+                    </a:xfrm>
+                    <a:prstGeom prst="rect">
+                      <a:avLst/>
+                    </a:prstGeom>
+                  </pic:spPr>
+                </pic:pic>
+              </a:graphicData>
+            </a:graphic>
+          </wp:inline>
+        </w:drawing>
+      </w:r>
+    </w:p>
+    <w:p>
+      <w:pPr>
+        <w:pStyle w:val="Caption"/>
+        <w:rPr>
+          <w:color w:val="156082" w:themeColor="accent1"/>
+          <w:lang w:val="nl-NL"/>
+        </w:rPr>
+      </w:pPr>
+      <w:r>
+        <w:rPr>
+          <w:lang w:val="nl-NL"/>
+        </w:rPr>
+        <w:t xml:space="preserve">Figuur </w:t>
+      </w:r>
+      <w:r>
+        <w:fldChar w:fldCharType="begin"/>
+      </w:r>
+      <w:r>
+        <w:rPr>
+          <w:lang w:val="nl-NL"/>
+        </w:rPr>
+        <w:instrText xml:space="preserve"> SEQ Figuur \* ARABIC </w:instrText>
+      </w:r>
+      <w:r>
+        <w:fldChar w:fldCharType="separate"/>
+      </w:r>
+      <w:r>
+        <w:rPr>
+          <w:noProof/>
+          <w:lang w:val="nl-NL"/>
+        </w:rPr>
+        <w:t>12</w:t>
+      </w:r>
+      <w:r>
+        <w:fldChar w:fldCharType="end"/>
+      </w:r>
+      <w:r>
+        <w:rPr>
+          <w:lang w:val="nl-NL"/>
+        </w:rPr>
+        <w:t>: Aangemaakte containers</w:t>
+      </w:r>
+    </w:p>
+    <w:p>
+      <w:pPr>
+        <w:rPr>
+          <w:color w:val="156082" w:themeColor="accent1"/>
+          <w:lang w:val="nl-NL"/>
+        </w:rPr>
+      </w:pPr>
+    </w:p>
+    <w:p>
+      <w:pPr>
+        <w:rPr>
+          <w:color w:val="156082" w:themeColor="accent1"/>
+          <w:lang w:val="nl-NL"/>
+        </w:rPr>
+      </w:pPr>
+    </w:p>
+    <w:p>
+      <w:pPr>
+        <w:rPr>
+          <w:color w:val="156082" w:themeColor="accent1"/>
+          <w:lang w:val="nl-NL"/>
+        </w:rPr>
+      </w:pPr>
+    </w:p>
+    <w:p>
+      <w:pPr>
+        <w:rPr>
+          <w:color w:val="156082" w:themeColor="accent1"/>
+          <w:lang w:val="nl-NL"/>
+        </w:rPr>
+      </w:pPr>
+    </w:p>
+    <w:p>
+      <w:pPr>
+        <w:rPr>
+          <w:color w:val="156082" w:themeColor="accent1"/>
+          <w:lang w:val="nl-NL"/>
+        </w:rPr>
+      </w:pPr>
+      <w:r>
+        <w:rPr>
+          <w:color w:val="156082" w:themeColor="accent1"/>
+          <w:lang w:val="nl-NL"/>
+        </w:rPr>
+        <w:lastRenderedPageBreak/>
+        <w:t xml:space="preserve">3. Upload in beide containers een testbestand, bijvoorbeeld een afbeelding of tekstbestand. </w:t>
+      </w:r>
+    </w:p>
+    <w:p>
+      <w:pPr>
+        <w:keepNext/>
+      </w:pPr>
+      <w:r>
+        <w:rPr>
+          <w:color w:val="156082" w:themeColor="accent1"/>
+          <w:lang w:val="nl-NL"/>
+        </w:rPr>
+        <w:drawing>
+          <wp:inline distT="0" distB="0" distL="0" distR="0" wp14:anchorId="302267F9" wp14:editId="44CF45C8">
+            <wp:extent cx="5731510" cy="2199005"/>
+            <wp:effectExtent l="0" t="0" r="2540" b="0"/>
+            <wp:docPr id="528382959" name="Picture 1"/>
+            <wp:cNvGraphicFramePr>
+              <a:graphicFrameLocks xmlns:a="http://schemas.openxmlformats.org/drawingml/2006/main" noChangeAspect="1"/>
+            </wp:cNvGraphicFramePr>
+            <a:graphic xmlns:a="http://schemas.openxmlformats.org/drawingml/2006/main">
+              <a:graphicData uri="http://schemas.openxmlformats.org/drawingml/2006/picture">
+                <pic:pic xmlns:pic="http://schemas.openxmlformats.org/drawingml/2006/picture">
+                  <pic:nvPicPr>
+                    <pic:cNvPr id="528382959" name=""/>
+                    <pic:cNvPicPr/>
+                  </pic:nvPicPr>
+                  <pic:blipFill>
+                    <a:blip r:embed="rId21"/>
+                    <a:stretch>
+                      <a:fillRect/>
+                    </a:stretch>
+                  </pic:blipFill>
+                  <pic:spPr>
+                    <a:xfrm>
+                      <a:off x="0" y="0"/>
+                      <a:ext cx="5731510" cy="2199005"/>
+                    </a:xfrm>
+                    <a:prstGeom prst="rect">
+                      <a:avLst/>
+                    </a:prstGeom>
+                  </pic:spPr>
+                </pic:pic>
+              </a:graphicData>
+            </a:graphic>
+          </wp:inline>
+        </w:drawing>
+      </w:r>
+    </w:p>
+    <w:p>
+      <w:pPr>
+        <w:pStyle w:val="Caption"/>
       </w:pPr>
       <w:proofErr w:type="spellStart"/>
       <w:r>
@@ -12347,45 +13180,855 @@
           <w:rPr>
             <w:noProof/>
           </w:rPr>
-          <w:t>11</w:t>
+          <w:t>13</w:t>
         </w:r>
       </w:fldSimple>
       <w:r>
-        <w:t xml:space="preserve">: Uncomplicated Firewall </w:t>
+        <w:t xml:space="preserve">: </w:t>
       </w:r>
       <w:proofErr w:type="spellStart"/>
       <w:r>
-        <w:t>toegevoegd</w:t>
+        <w:t>Bestand</w:t>
+      </w:r>
+      <w:proofErr w:type="spellEnd"/>
+      <w:r>
+        <w:t xml:space="preserve"> in </w:t>
+      </w:r>
+      <w:proofErr w:type="gramStart"/>
+      <w:r>
+        <w:t>private-container</w:t>
+      </w:r>
+      <w:proofErr w:type="gramEnd"/>
+    </w:p>
+    <w:p/>
+    <w:p>
+      <w:pPr>
+        <w:keepNext/>
+      </w:pPr>
+      <w:r>
+        <w:drawing>
+          <wp:inline distT="0" distB="0" distL="0" distR="0" wp14:anchorId="76D3B3D7" wp14:editId="2B2FF680">
+            <wp:extent cx="5731510" cy="2234565"/>
+            <wp:effectExtent l="0" t="0" r="2540" b="0"/>
+            <wp:docPr id="1164919849" name="Picture 1"/>
+            <wp:cNvGraphicFramePr>
+              <a:graphicFrameLocks xmlns:a="http://schemas.openxmlformats.org/drawingml/2006/main" noChangeAspect="1"/>
+            </wp:cNvGraphicFramePr>
+            <a:graphic xmlns:a="http://schemas.openxmlformats.org/drawingml/2006/main">
+              <a:graphicData uri="http://schemas.openxmlformats.org/drawingml/2006/picture">
+                <pic:pic xmlns:pic="http://schemas.openxmlformats.org/drawingml/2006/picture">
+                  <pic:nvPicPr>
+                    <pic:cNvPr id="1164919849" name=""/>
+                    <pic:cNvPicPr/>
+                  </pic:nvPicPr>
+                  <pic:blipFill>
+                    <a:blip r:embed="rId22"/>
+                    <a:stretch>
+                      <a:fillRect/>
+                    </a:stretch>
+                  </pic:blipFill>
+                  <pic:spPr>
+                    <a:xfrm>
+                      <a:off x="0" y="0"/>
+                      <a:ext cx="5731510" cy="2234565"/>
+                    </a:xfrm>
+                    <a:prstGeom prst="rect">
+                      <a:avLst/>
+                    </a:prstGeom>
+                  </pic:spPr>
+                </pic:pic>
+              </a:graphicData>
+            </a:graphic>
+          </wp:inline>
+        </w:drawing>
+      </w:r>
+    </w:p>
+    <w:p>
+      <w:pPr>
+        <w:pStyle w:val="Caption"/>
+        <w:rPr>
+          <w:lang w:val="nl-NL"/>
+        </w:rPr>
+      </w:pPr>
+      <w:r>
+        <w:rPr>
+          <w:lang w:val="nl-NL"/>
+        </w:rPr>
+        <w:t xml:space="preserve">Figuur </w:t>
+      </w:r>
+      <w:r>
+        <w:fldChar w:fldCharType="begin"/>
+      </w:r>
+      <w:r>
+        <w:rPr>
+          <w:lang w:val="nl-NL"/>
+        </w:rPr>
+        <w:instrText xml:space="preserve"> SEQ Figuur \* ARABIC </w:instrText>
+      </w:r>
+      <w:r>
+        <w:fldChar w:fldCharType="separate"/>
+      </w:r>
+      <w:r>
+        <w:rPr>
+          <w:noProof/>
+          <w:lang w:val="nl-NL"/>
+        </w:rPr>
+        <w:t>14</w:t>
+      </w:r>
+      <w:r>
+        <w:fldChar w:fldCharType="end"/>
+      </w:r>
+      <w:r>
+        <w:rPr>
+          <w:lang w:val="nl-NL"/>
+        </w:rPr>
+        <w:t>: Bestand in public-container</w:t>
+      </w:r>
+    </w:p>
+    <w:p>
+      <w:pPr>
+        <w:rPr>
+          <w:lang w:val="nl-NL"/>
+        </w:rPr>
+      </w:pPr>
+    </w:p>
+    <w:p>
+      <w:pPr>
+        <w:rPr>
+          <w:color w:val="156082" w:themeColor="accent1"/>
+          <w:lang w:val="nl-NL"/>
+        </w:rPr>
+      </w:pPr>
+    </w:p>
+    <w:p>
+      <w:pPr>
+        <w:rPr>
+          <w:color w:val="156082" w:themeColor="accent1"/>
+          <w:lang w:val="nl-NL"/>
+        </w:rPr>
+      </w:pPr>
+    </w:p>
+    <w:p>
+      <w:pPr>
+        <w:rPr>
+          <w:color w:val="156082" w:themeColor="accent1"/>
+          <w:lang w:val="nl-NL"/>
+        </w:rPr>
+      </w:pPr>
+    </w:p>
+    <w:p>
+      <w:pPr>
+        <w:rPr>
+          <w:color w:val="156082" w:themeColor="accent1"/>
+          <w:lang w:val="nl-NL"/>
+        </w:rPr>
+      </w:pPr>
+    </w:p>
+    <w:p>
+      <w:pPr>
+        <w:rPr>
+          <w:color w:val="156082" w:themeColor="accent1"/>
+          <w:lang w:val="nl-NL"/>
+        </w:rPr>
+      </w:pPr>
+    </w:p>
+    <w:p>
+      <w:pPr>
+        <w:rPr>
+          <w:color w:val="156082" w:themeColor="accent1"/>
+          <w:lang w:val="nl-NL"/>
+        </w:rPr>
+      </w:pPr>
+    </w:p>
+    <w:p>
+      <w:pPr>
+        <w:rPr>
+          <w:color w:val="156082" w:themeColor="accent1"/>
+          <w:lang w:val="nl-NL"/>
+        </w:rPr>
+      </w:pPr>
+    </w:p>
+    <w:p>
+      <w:pPr>
+        <w:rPr>
+          <w:color w:val="156082" w:themeColor="accent1"/>
+          <w:lang w:val="nl-NL"/>
+        </w:rPr>
+      </w:pPr>
+      <w:r>
+        <w:rPr>
+          <w:color w:val="156082" w:themeColor="accent1"/>
+          <w:lang w:val="nl-NL"/>
+        </w:rPr>
+        <w:lastRenderedPageBreak/>
+        <w:t xml:space="preserve">4. Open een incognito browservenster en probeer het publieke bestand te benaderen via directe URL. </w:t>
+      </w:r>
+    </w:p>
+    <w:p>
+      <w:pPr>
+        <w:keepNext/>
+      </w:pPr>
+      <w:r>
+        <w:rPr>
+          <w:color w:val="156082" w:themeColor="accent1"/>
+          <w:lang w:val="nl-NL"/>
+        </w:rPr>
+        <w:drawing>
+          <wp:inline distT="0" distB="0" distL="0" distR="0" wp14:anchorId="48DDFC93" wp14:editId="51857C87">
+            <wp:extent cx="5731510" cy="4993005"/>
+            <wp:effectExtent l="0" t="0" r="2540" b="0"/>
+            <wp:docPr id="1973636683" name="Picture 1"/>
+            <wp:cNvGraphicFramePr>
+              <a:graphicFrameLocks xmlns:a="http://schemas.openxmlformats.org/drawingml/2006/main" noChangeAspect="1"/>
+            </wp:cNvGraphicFramePr>
+            <a:graphic xmlns:a="http://schemas.openxmlformats.org/drawingml/2006/main">
+              <a:graphicData uri="http://schemas.openxmlformats.org/drawingml/2006/picture">
+                <pic:pic xmlns:pic="http://schemas.openxmlformats.org/drawingml/2006/picture">
+                  <pic:nvPicPr>
+                    <pic:cNvPr id="1973636683" name=""/>
+                    <pic:cNvPicPr/>
+                  </pic:nvPicPr>
+                  <pic:blipFill>
+                    <a:blip r:embed="rId23"/>
+                    <a:stretch>
+                      <a:fillRect/>
+                    </a:stretch>
+                  </pic:blipFill>
+                  <pic:spPr>
+                    <a:xfrm>
+                      <a:off x="0" y="0"/>
+                      <a:ext cx="5731510" cy="4993005"/>
+                    </a:xfrm>
+                    <a:prstGeom prst="rect">
+                      <a:avLst/>
+                    </a:prstGeom>
+                  </pic:spPr>
+                </pic:pic>
+              </a:graphicData>
+            </a:graphic>
+          </wp:inline>
+        </w:drawing>
+      </w:r>
+    </w:p>
+    <w:p>
+      <w:pPr>
+        <w:pStyle w:val="Caption"/>
+      </w:pPr>
+      <w:proofErr w:type="spellStart"/>
+      <w:r>
+        <w:t>Figuur</w:t>
+      </w:r>
+      <w:proofErr w:type="spellEnd"/>
+      <w:r>
+        <w:t xml:space="preserve"> </w:t>
+      </w:r>
+      <w:fldSimple w:instr=" SEQ Figuur \* ARABIC ">
+        <w:r>
+          <w:rPr>
+            <w:noProof/>
+          </w:rPr>
+          <w:t>15</w:t>
+        </w:r>
+      </w:fldSimple>
+      <w:r>
+        <w:t xml:space="preserve">: </w:t>
+      </w:r>
+      <w:proofErr w:type="spellStart"/>
+      <w:r>
+        <w:t>Bestand</w:t>
+      </w:r>
+      <w:proofErr w:type="spellEnd"/>
+      <w:r>
+        <w:t xml:space="preserve"> </w:t>
+      </w:r>
+      <w:proofErr w:type="gramStart"/>
+      <w:r>
+        <w:t>public-container</w:t>
+      </w:r>
+      <w:proofErr w:type="gramEnd"/>
+    </w:p>
+    <w:p>
+      <w:pPr>
+        <w:rPr>
+          <w:lang w:val="nl-NL"/>
+        </w:rPr>
+      </w:pPr>
+    </w:p>
+    <w:p>
+      <w:pPr>
+        <w:rPr>
+          <w:color w:val="156082" w:themeColor="accent1"/>
+          <w:lang w:val="nl-NL"/>
+        </w:rPr>
+      </w:pPr>
+      <w:r>
+        <w:rPr>
+          <w:color w:val="156082" w:themeColor="accent1"/>
+          <w:lang w:val="nl-NL"/>
+        </w:rPr>
+        <w:t xml:space="preserve">5. Probeer hetzelfde met het bestand in de private container → dit moet mislukken. </w:t>
+      </w:r>
+    </w:p>
+    <w:p>
+      <w:pPr>
+        <w:keepNext/>
+      </w:pPr>
+      <w:r>
+        <w:rPr>
+          <w:color w:val="156082" w:themeColor="accent1"/>
+          <w:lang w:val="nl-NL"/>
+        </w:rPr>
+        <w:drawing>
+          <wp:inline distT="0" distB="0" distL="0" distR="0" wp14:anchorId="5EFFB84A" wp14:editId="76886027">
+            <wp:extent cx="5731510" cy="1459865"/>
+            <wp:effectExtent l="0" t="0" r="2540" b="6985"/>
+            <wp:docPr id="1294126062" name="Picture 1"/>
+            <wp:cNvGraphicFramePr>
+              <a:graphicFrameLocks xmlns:a="http://schemas.openxmlformats.org/drawingml/2006/main" noChangeAspect="1"/>
+            </wp:cNvGraphicFramePr>
+            <a:graphic xmlns:a="http://schemas.openxmlformats.org/drawingml/2006/main">
+              <a:graphicData uri="http://schemas.openxmlformats.org/drawingml/2006/picture">
+                <pic:pic xmlns:pic="http://schemas.openxmlformats.org/drawingml/2006/picture">
+                  <pic:nvPicPr>
+                    <pic:cNvPr id="1294126062" name=""/>
+                    <pic:cNvPicPr/>
+                  </pic:nvPicPr>
+                  <pic:blipFill>
+                    <a:blip r:embed="rId24"/>
+                    <a:stretch>
+                      <a:fillRect/>
+                    </a:stretch>
+                  </pic:blipFill>
+                  <pic:spPr>
+                    <a:xfrm>
+                      <a:off x="0" y="0"/>
+                      <a:ext cx="5731510" cy="1459865"/>
+                    </a:xfrm>
+                    <a:prstGeom prst="rect">
+                      <a:avLst/>
+                    </a:prstGeom>
+                  </pic:spPr>
+                </pic:pic>
+              </a:graphicData>
+            </a:graphic>
+          </wp:inline>
+        </w:drawing>
+      </w:r>
+    </w:p>
+    <w:p>
+      <w:pPr>
+        <w:pStyle w:val="Caption"/>
+        <w:rPr>
+          <w:color w:val="156082" w:themeColor="accent1"/>
+          <w:lang w:val="nl-NL"/>
+        </w:rPr>
+      </w:pPr>
+      <w:r>
+        <w:rPr>
+          <w:lang w:val="nl-NL"/>
+        </w:rPr>
+        <w:t xml:space="preserve">Figuur </w:t>
+      </w:r>
+      <w:r>
+        <w:fldChar w:fldCharType="begin"/>
+      </w:r>
+      <w:r>
+        <w:rPr>
+          <w:lang w:val="nl-NL"/>
+        </w:rPr>
+        <w:instrText xml:space="preserve"> SEQ Figuur \* ARABIC </w:instrText>
+      </w:r>
+      <w:r>
+        <w:fldChar w:fldCharType="separate"/>
+      </w:r>
+      <w:r>
+        <w:rPr>
+          <w:noProof/>
+          <w:lang w:val="nl-NL"/>
+        </w:rPr>
+        <w:t>16</w:t>
+      </w:r>
+      <w:r>
+        <w:fldChar w:fldCharType="end"/>
+      </w:r>
+      <w:r>
+        <w:rPr>
+          <w:lang w:val="nl-NL"/>
+        </w:rPr>
+        <w:t>: Bestand private-container, mislukt</w:t>
+      </w:r>
+    </w:p>
+    <w:p>
+      <w:pPr>
+        <w:rPr>
+          <w:color w:val="156082" w:themeColor="accent1"/>
+          <w:lang w:val="nl-NL"/>
+        </w:rPr>
+      </w:pPr>
+    </w:p>
+    <w:p>
+      <w:pPr>
+        <w:rPr>
+          <w:color w:val="156082" w:themeColor="accent1"/>
+          <w:lang w:val="nl-NL"/>
+        </w:rPr>
+      </w:pPr>
+    </w:p>
+    <w:p>
+      <w:pPr>
+        <w:rPr>
+          <w:color w:val="156082" w:themeColor="accent1"/>
+          <w:lang w:val="nl-NL"/>
+        </w:rPr>
+      </w:pPr>
+      <w:r>
+        <w:rPr>
+          <w:color w:val="156082" w:themeColor="accent1"/>
+          <w:lang w:val="nl-NL"/>
+        </w:rPr>
+        <w:t xml:space="preserve">6. Genereer nu een SAS-token voor het bestand in de private-container met: - Alleen leesrechten (Read) - Een eindtijd die maximaal 15 minuten in de toekomst ligt </w:t>
+      </w:r>
+    </w:p>
+    <w:p>
+      <w:pPr>
+        <w:keepNext/>
+      </w:pPr>
+      <w:r>
+        <w:rPr>
+          <w:color w:val="156082" w:themeColor="accent1"/>
+          <w:lang w:val="nl-NL"/>
+        </w:rPr>
+        <w:drawing>
+          <wp:inline distT="0" distB="0" distL="0" distR="0" wp14:anchorId="5A282EA9" wp14:editId="5C44592C">
+            <wp:extent cx="4831644" cy="4508321"/>
+            <wp:effectExtent l="0" t="0" r="7620" b="6985"/>
+            <wp:docPr id="1383349257" name="Picture 1"/>
+            <wp:cNvGraphicFramePr>
+              <a:graphicFrameLocks xmlns:a="http://schemas.openxmlformats.org/drawingml/2006/main" noChangeAspect="1"/>
+            </wp:cNvGraphicFramePr>
+            <a:graphic xmlns:a="http://schemas.openxmlformats.org/drawingml/2006/main">
+              <a:graphicData uri="http://schemas.openxmlformats.org/drawingml/2006/picture">
+                <pic:pic xmlns:pic="http://schemas.openxmlformats.org/drawingml/2006/picture">
+                  <pic:nvPicPr>
+                    <pic:cNvPr id="1383349257" name=""/>
+                    <pic:cNvPicPr/>
+                  </pic:nvPicPr>
+                  <pic:blipFill>
+                    <a:blip r:embed="rId25"/>
+                    <a:stretch>
+                      <a:fillRect/>
+                    </a:stretch>
+                  </pic:blipFill>
+                  <pic:spPr>
+                    <a:xfrm>
+                      <a:off x="0" y="0"/>
+                      <a:ext cx="4834683" cy="4511157"/>
+                    </a:xfrm>
+                    <a:prstGeom prst="rect">
+                      <a:avLst/>
+                    </a:prstGeom>
+                  </pic:spPr>
+                </pic:pic>
+              </a:graphicData>
+            </a:graphic>
+          </wp:inline>
+        </w:drawing>
+      </w:r>
+    </w:p>
+    <w:p>
+      <w:pPr>
+        <w:pStyle w:val="Caption"/>
+      </w:pPr>
+      <w:proofErr w:type="spellStart"/>
+      <w:r>
+        <w:t>Figuur</w:t>
+      </w:r>
+      <w:proofErr w:type="spellEnd"/>
+      <w:r>
+        <w:t xml:space="preserve"> </w:t>
+      </w:r>
+      <w:fldSimple w:instr=" SEQ Figuur \* ARABIC ">
+        <w:r>
+          <w:rPr>
+            <w:noProof/>
+          </w:rPr>
+          <w:t>17</w:t>
+        </w:r>
+      </w:fldSimple>
+      <w:r>
+        <w:t xml:space="preserve">: SAS-token </w:t>
+      </w:r>
+      <w:proofErr w:type="spellStart"/>
+      <w:r>
+        <w:t>gegenereerd</w:t>
       </w:r>
       <w:proofErr w:type="spellEnd"/>
     </w:p>
     <w:p>
       <w:pPr>
         <w:rPr>
-          <w:i/>
-          <w:iCs/>
-          <w:color w:val="0E2841" w:themeColor="text2"/>
-          <w:sz w:val="18"/>
-          <w:szCs w:val="18"/>
+          <w:lang w:val="nl-NL"/>
         </w:rPr>
       </w:pPr>
-      <w:r>
-        <w:br w:type="page"/>
-      </w:r>
     </w:p>
     <w:p>
       <w:pPr>
         <w:rPr>
-          <w:i/>
-          <w:iCs/>
+          <w:lang w:val="nl-NL"/>
+        </w:rPr>
+      </w:pPr>
+    </w:p>
+    <w:p>
+      <w:pPr>
+        <w:rPr>
+          <w:lang w:val="nl-NL"/>
+        </w:rPr>
+      </w:pPr>
+    </w:p>
+    <w:p>
+      <w:pPr>
+        <w:rPr>
+          <w:lang w:val="nl-NL"/>
+        </w:rPr>
+      </w:pPr>
+    </w:p>
+    <w:p>
+      <w:pPr>
+        <w:rPr>
+          <w:lang w:val="nl-NL"/>
+        </w:rPr>
+      </w:pPr>
+    </w:p>
+    <w:p>
+      <w:pPr>
+        <w:rPr>
+          <w:lang w:val="nl-NL"/>
+        </w:rPr>
+      </w:pPr>
+    </w:p>
+    <w:p>
+      <w:pPr>
+        <w:rPr>
+          <w:lang w:val="nl-NL"/>
+        </w:rPr>
+      </w:pPr>
+    </w:p>
+    <w:p>
+      <w:pPr>
+        <w:rPr>
+          <w:lang w:val="nl-NL"/>
+        </w:rPr>
+      </w:pPr>
+    </w:p>
+    <w:p>
+      <w:pPr>
+        <w:rPr>
+          <w:lang w:val="nl-NL"/>
+        </w:rPr>
+      </w:pPr>
+    </w:p>
+    <w:p>
+      <w:pPr>
+        <w:rPr>
+          <w:lang w:val="nl-NL"/>
+        </w:rPr>
+      </w:pPr>
+    </w:p>
+    <w:p>
+      <w:pPr>
+        <w:rPr>
           <w:color w:val="156082" w:themeColor="accent1"/>
-          <w:sz w:val="18"/>
-          <w:szCs w:val="18"/>
+          <w:lang w:val="nl-NL"/>
+        </w:rPr>
+      </w:pPr>
+      <w:r>
+        <w:rPr>
+          <w:color w:val="156082" w:themeColor="accent1"/>
+          <w:lang w:val="nl-NL"/>
+        </w:rPr>
+        <w:lastRenderedPageBreak/>
+        <w:t xml:space="preserve">7. Gebruik de SAS-link in een incognito venster om te testen of je toegang hebt. </w:t>
+      </w:r>
+    </w:p>
+    <w:p>
+      <w:pPr>
+        <w:keepNext/>
+      </w:pPr>
+      <w:r>
+        <w:rPr>
+          <w:color w:val="156082" w:themeColor="accent1"/>
+          <w:lang w:val="nl-NL"/>
+        </w:rPr>
+        <w:drawing>
+          <wp:inline distT="0" distB="0" distL="0" distR="0" wp14:anchorId="0ABF29F1" wp14:editId="479A360C">
+            <wp:extent cx="5731510" cy="5032375"/>
+            <wp:effectExtent l="0" t="0" r="2540" b="0"/>
+            <wp:docPr id="1007643884" name="Picture 1"/>
+            <wp:cNvGraphicFramePr>
+              <a:graphicFrameLocks xmlns:a="http://schemas.openxmlformats.org/drawingml/2006/main" noChangeAspect="1"/>
+            </wp:cNvGraphicFramePr>
+            <a:graphic xmlns:a="http://schemas.openxmlformats.org/drawingml/2006/main">
+              <a:graphicData uri="http://schemas.openxmlformats.org/drawingml/2006/picture">
+                <pic:pic xmlns:pic="http://schemas.openxmlformats.org/drawingml/2006/picture">
+                  <pic:nvPicPr>
+                    <pic:cNvPr id="1007643884" name=""/>
+                    <pic:cNvPicPr/>
+                  </pic:nvPicPr>
+                  <pic:blipFill>
+                    <a:blip r:embed="rId26"/>
+                    <a:stretch>
+                      <a:fillRect/>
+                    </a:stretch>
+                  </pic:blipFill>
+                  <pic:spPr>
+                    <a:xfrm>
+                      <a:off x="0" y="0"/>
+                      <a:ext cx="5731510" cy="5032375"/>
+                    </a:xfrm>
+                    <a:prstGeom prst="rect">
+                      <a:avLst/>
+                    </a:prstGeom>
+                  </pic:spPr>
+                </pic:pic>
+              </a:graphicData>
+            </a:graphic>
+          </wp:inline>
+        </w:drawing>
+      </w:r>
+    </w:p>
+    <w:p>
+      <w:pPr>
+        <w:pStyle w:val="Caption"/>
+        <w:rPr>
+          <w:lang w:val="nl-NL"/>
+        </w:rPr>
+      </w:pPr>
+      <w:r>
+        <w:rPr>
+          <w:lang w:val="nl-NL"/>
+        </w:rPr>
+        <w:t xml:space="preserve">Figuur </w:t>
+      </w:r>
+      <w:r>
+        <w:fldChar w:fldCharType="begin"/>
+      </w:r>
+      <w:r>
+        <w:rPr>
+          <w:lang w:val="nl-NL"/>
+        </w:rPr>
+        <w:instrText xml:space="preserve"> SEQ Figuur \* ARABIC </w:instrText>
+      </w:r>
+      <w:r>
+        <w:fldChar w:fldCharType="separate"/>
+      </w:r>
+      <w:r>
+        <w:rPr>
+          <w:noProof/>
+          <w:lang w:val="nl-NL"/>
+        </w:rPr>
+        <w:t>18</w:t>
+      </w:r>
+      <w:r>
+        <w:fldChar w:fldCharType="end"/>
+      </w:r>
+      <w:r>
+        <w:rPr>
+          <w:lang w:val="nl-NL"/>
+        </w:rPr>
+        <w:t>: Bestand private-container, gelukt met SAS</w:t>
+      </w:r>
+    </w:p>
+    <w:p>
+      <w:pPr>
+        <w:rPr>
+          <w:lang w:val="nl-NL"/>
+        </w:rPr>
+      </w:pPr>
+    </w:p>
+    <w:p>
+      <w:pPr>
+        <w:rPr>
+          <w:color w:val="156082" w:themeColor="accent1"/>
+          <w:lang w:val="nl-NL"/>
+        </w:rPr>
+      </w:pPr>
+      <w:r>
+        <w:rPr>
+          <w:color w:val="156082" w:themeColor="accent1"/>
+          <w:lang w:val="nl-NL"/>
+        </w:rPr>
+        <w:t xml:space="preserve">8. Wacht totdat het SAS-token verlopen is, of verwijder de token (indien beleid dit toestaat) en test opnieuw. </w:t>
+      </w:r>
+    </w:p>
+    <w:p>
+      <w:pPr>
+        <w:rPr>
+          <w:lang w:val="nl-NL"/>
+        </w:rPr>
+      </w:pPr>
+      <w:r>
+        <w:rPr>
+          <w:lang w:val="nl-NL"/>
+        </w:rPr>
+        <w:t>Nu geeft hij dezelfde melding als in Figuur 16.</w:t>
+      </w:r>
+      <w:r>
+        <w:rPr>
+          <w:lang w:val="nl-NL"/>
+        </w:rPr>
+        <w:t xml:space="preserve"> Dat klopt, want de vervaltijd is voorbij.</w:t>
+      </w:r>
+    </w:p>
+    <w:p>
+      <w:pPr>
+        <w:rPr>
+          <w:color w:val="156082" w:themeColor="accent1"/>
+          <w:lang w:val="nl-NL"/>
+        </w:rPr>
+      </w:pPr>
+      <w:r>
+        <w:rPr>
+          <w:color w:val="156082" w:themeColor="accent1"/>
+          <w:lang w:val="nl-NL"/>
+        </w:rPr>
+        <w:br w:type="page"/>
+      </w:r>
+    </w:p>
+    <w:p>
+      <w:pPr>
+        <w:rPr>
+          <w:color w:val="156082" w:themeColor="accent1"/>
+          <w:lang w:val="nl-NL"/>
+        </w:rPr>
+      </w:pPr>
+      <w:r>
+        <w:rPr>
+          <w:color w:val="156082" w:themeColor="accent1"/>
+          <w:lang w:val="nl-NL"/>
+        </w:rPr>
+        <w:lastRenderedPageBreak/>
+        <w:t xml:space="preserve">Reflectievragen </w:t>
+      </w:r>
+    </w:p>
+    <w:p>
+      <w:pPr>
+        <w:rPr>
+          <w:color w:val="156082" w:themeColor="accent1"/>
+          <w:lang w:val="nl-NL"/>
+        </w:rPr>
+      </w:pPr>
+      <w:r>
+        <w:rPr>
+          <w:color w:val="156082" w:themeColor="accent1"/>
+          <w:lang w:val="nl-NL"/>
+        </w:rPr>
+        <w:t xml:space="preserve">1. Wat is het verschil tussen toegang via SAS en toegang via IAM? </w:t>
+      </w:r>
+    </w:p>
+    <w:p>
+      <w:pPr>
+        <w:rPr>
+          <w:lang w:val="nl-NL"/>
+        </w:rPr>
+      </w:pPr>
+      <w:r>
+        <w:rPr>
+          <w:lang w:val="nl-NL"/>
+        </w:rPr>
+        <w:t>Via IAM krijgt de gebruiker rechten op basis van de rol</w:t>
+      </w:r>
+      <w:r>
+        <w:rPr>
+          <w:lang w:val="nl-NL"/>
+        </w:rPr>
+        <w:t xml:space="preserve">, in dit geval ‘contributor’. Met een SAS-token kan iemand via een link tijdelijke toegang krijgen, zonder dat er een Azure account nodig is. </w:t>
+      </w:r>
+    </w:p>
+    <w:p>
+      <w:pPr>
+        <w:rPr>
+          <w:color w:val="156082" w:themeColor="accent1"/>
+          <w:lang w:val="nl-NL"/>
+        </w:rPr>
+      </w:pPr>
+      <w:r>
+        <w:rPr>
+          <w:color w:val="156082" w:themeColor="accent1"/>
+          <w:lang w:val="nl-NL"/>
+        </w:rPr>
+        <w:t xml:space="preserve">2. Waarom zou je ervoor kiezen om een bestand niet publiek te delen, maar toch tijdelijk toegang te geven? </w:t>
+      </w:r>
+    </w:p>
+    <w:p>
+      <w:pPr>
+        <w:rPr>
+          <w:lang w:val="nl-NL"/>
+        </w:rPr>
+      </w:pPr>
+      <w:r>
+        <w:rPr>
+          <w:lang w:val="nl-NL"/>
+        </w:rPr>
+        <w:t>Zo voorkom je dat iedereen op internet het bestand kan openen. Met een token kan je mensen tijdelijk toegang geven met de gewenste rechten en voor de gewenste tijd.</w:t>
+      </w:r>
+    </w:p>
+    <w:p>
+      <w:pPr>
+        <w:rPr>
+          <w:color w:val="156082" w:themeColor="accent1"/>
+          <w:lang w:val="nl-NL"/>
+        </w:rPr>
+      </w:pPr>
+      <w:r>
+        <w:rPr>
+          <w:color w:val="156082" w:themeColor="accent1"/>
+          <w:lang w:val="nl-NL"/>
+        </w:rPr>
+        <w:t xml:space="preserve">3. Wat zijn de risico’s van het delen van SAS-links met anderen? </w:t>
+      </w:r>
+    </w:p>
+    <w:p>
+      <w:pPr>
+        <w:rPr>
+          <w:lang w:val="nl-NL"/>
+        </w:rPr>
+      </w:pPr>
+      <w:r>
+        <w:rPr>
+          <w:lang w:val="nl-NL"/>
+        </w:rPr>
+        <w:t xml:space="preserve">Een SAS-link kan makkelijk gedeeld worden. Iedereen met de link kan de pagina bezoeken, ook al is het een ongeautoriseerd persoon. </w:t>
+      </w:r>
+      <w:r>
+        <w:rPr>
+          <w:lang w:val="nl-NL"/>
+        </w:rPr>
+        <w:t xml:space="preserve">Hierom is het belangrijk dat je de rechten en tijdsduur zo beperkt mogelijk houdt. </w:t>
+      </w:r>
+    </w:p>
+    <w:p>
+      <w:pPr>
+        <w:rPr>
+          <w:color w:val="156082" w:themeColor="accent1"/>
+          <w:lang w:val="nl-NL"/>
+        </w:rPr>
+      </w:pPr>
+      <w:r>
+        <w:rPr>
+          <w:color w:val="156082" w:themeColor="accent1"/>
+          <w:lang w:val="nl-NL"/>
+        </w:rPr>
+        <w:t>4. Wanneer gebruik je IAM in plaats van een SAS-token (of omgekeerd)?</w:t>
+      </w:r>
+    </w:p>
+    <w:p>
+      <w:pPr>
+        <w:rPr>
           <w:lang w:val="nl-NL"/>
         </w:rPr>
         <w:sectPr>
-          <w:footerReference w:type="default" r:id="rId20"/>
-          <w:footerReference w:type="first" r:id="rId21"/>
+          <w:footerReference w:type="default" r:id="rId27"/>
+          <w:footerReference w:type="first" r:id="rId28"/>
           <w:pgSz w:w="11906" w:h="16838"/>
           <w:pgMar w:top="1440" w:right="1440" w:bottom="1440" w:left="1440" w:header="708" w:footer="708" w:gutter="0"/>
           <w:pgNumType w:start="1"/>
@@ -12393,6 +14036,18 @@
           <w:docGrid w:linePitch="360"/>
         </w:sectPr>
       </w:pPr>
+      <w:r>
+        <w:rPr>
+          <w:lang w:val="nl-NL"/>
+        </w:rPr>
+        <w:t xml:space="preserve">IAM gebruik je voor </w:t>
+      </w:r>
+      <w:r>
+        <w:rPr>
+          <w:lang w:val="nl-NL"/>
+        </w:rPr>
+        <w:t xml:space="preserve">vaste gebruikers die regelmatig toegang nodig hebben  en waarbij je deze toegang op basis van rollen wil beheren. Een SAS-token gebruik je voor tijdelijke en beperkte toegang, bijvoorbeeld wanneer iemand  het bestand voor korte tijd moet lezen. </w:t>
+      </w:r>
     </w:p>
     <w:p>
       <w:pPr>
@@ -12401,7 +14056,7 @@
           <w:lang w:val="nl-NL"/>
         </w:rPr>
       </w:pPr>
-      <w:bookmarkStart w:id="18" w:name="_Toc239866168"/>
+      <w:bookmarkStart w:id="23" w:name="_Toc239939493"/>
       <w:r>
         <w:rPr>
           <w:lang w:val="nl-NL"/>
@@ -12409,7 +14064,7 @@
         <w:lastRenderedPageBreak/>
         <w:t>Bijlagen</w:t>
       </w:r>
-      <w:bookmarkEnd w:id="18"/>
+      <w:bookmarkEnd w:id="23"/>
     </w:p>
     <w:p>
       <w:pPr>
@@ -12418,14 +14073,14 @@
           <w:lang w:val="nl-NL"/>
         </w:rPr>
       </w:pPr>
-      <w:bookmarkStart w:id="19" w:name="_Toc239866169"/>
+      <w:bookmarkStart w:id="24" w:name="_Toc239939494"/>
       <w:r>
         <w:rPr>
           <w:lang w:val="nl-NL"/>
         </w:rPr>
         <w:t>Bijlage 1: Suricata Logs VM1 (open segment)</w:t>
       </w:r>
-      <w:bookmarkEnd w:id="19"/>
+      <w:bookmarkEnd w:id="24"/>
     </w:p>
     <w:tbl>
       <w:tblPr>
@@ -32912,7 +34567,7 @@
           <w:lang w:val="nl-NL"/>
         </w:rPr>
       </w:pPr>
-      <w:bookmarkStart w:id="20" w:name="_Toc239866170"/>
+      <w:bookmarkStart w:id="25" w:name="_Toc239939495"/>
       <w:r>
         <w:rPr>
           <w:lang w:val="nl-NL"/>
@@ -32920,7 +34575,7 @@
         <w:lastRenderedPageBreak/>
         <w:t>Bijlage 2: Suricata Logs VM2 (gesloten segment)</w:t>
       </w:r>
-      <w:bookmarkEnd w:id="20"/>
+      <w:bookmarkEnd w:id="25"/>
     </w:p>
     <w:p>
       <w:pPr>

</xml_diff>